<commit_message>
1.3.7-rasm: Xitoy NPL ma’lumotlari 2023–2025-yillar bilan yangilandi
Co-Authored-By: Claude Opus 5.5 <noreply@anthropic.com>
Claude-Session: https://claude.ai/code/session_01PxHTC8Q7yHdrpAeUA5KUgM
</commit_message>
<xml_diff>
--- a/paragraflar/1.3-xorijiy-tajriba.docx
+++ b/paragraflar/1.3-xorijiy-tajriba.docx
@@ -2,7 +2,7 @@
 <file path=word/document.xml><?xml version="1.0" encoding="utf-8"?>
 <w:document xmlns:w="http://schemas.openxmlformats.org/wordprocessingml/2006/main" xmlns:m="http://schemas.openxmlformats.org/officeDocument/2006/math" xmlns:r="http://schemas.openxmlformats.org/officeDocument/2006/relationships" xmlns:o="urn:schemas-microsoft-com:office:office" xmlns:v="urn:schemas-microsoft-com:vml" xmlns:w10="urn:schemas-microsoft-com:office:word" xmlns:a="http://schemas.openxmlformats.org/drawingml/2006/main" xmlns:pic="http://schemas.openxmlformats.org/drawingml/2006/picture" xmlns:wp="http://schemas.openxmlformats.org/drawingml/2006/wordprocessingDrawing">
   <w:body>
-    <w:bookmarkStart w:id="68" w:name="X0a8f05e5cd7bad167a6c1dddfdd9ff0edf10251"/>
+    <w:bookmarkStart w:id="73" w:name="X0a8f05e5cd7bad167a6c1dddfdd9ff0edf10251"/>
     <w:p>
       <w:pPr>
         <w:pStyle w:val="Heading2"/>
@@ -5411,7 +5411,7 @@
           <w:rFonts w:ascii="Times New Roman" w:hAnsi="Times New Roman" w:cs="Times New Roman" w:eastAsia="Times New Roman"/>
           <w:sz w:val="28"/>
         </w:rPr>
-        <w:t xml:space="preserve">. Xitoy tizimi murakkab modellarga emas, balki oddiy, ammo qat’iy miqdoriy cheklovlarga tayanadi. Xususan, kreditlarning depozitlarga nisbati 75 foizdan oshmasligi kerak va 2011-yil iyunidan boshlab bu ko‘rsatkich har kuni monitoring qilinadi; inqirozdan keyin esa kutilgan zararlar bo‘yicha 2,5 foizlik zaxira normativi joriy etilgan</w:t>
+        <w:t xml:space="preserve">. Keyinchalik bu komissiya sug‘urta nazorati bilan birlashtirilib, 2023-yilda Milliy moliyaviy nazorat boshqarmasiga aylantirildi. Xitoy tizimi murakkab modellarga emas, balki oddiy, ammo qat’iy miqdoriy cheklovlarga tayanadi. Xususan, kreditlarning depozitlarga nisbati 75 foizdan oshmasligi kerak va 2011-yil iyunidan boshlab bu ko‘rsatkich har kuni monitoring qilinadi; inqirozdan keyin esa kutilgan zararlar bo‘yicha 2,5 foizlik zaxira normativi joriy etilgan</w:t>
       </w:r>
       <w:r>
         <w:rPr>
@@ -5452,7 +5452,7 @@
           <w:rFonts w:ascii="Times New Roman" w:hAnsi="Times New Roman" w:cs="Times New Roman" w:eastAsia="Times New Roman"/>
           <w:sz w:val="28"/>
         </w:rPr>
-        <w:t xml:space="preserve">Biroq Xitoy tajribasi rasmiy ko‘rsatkichlarning ishonchliligi muammosini ham ochiq namoyon etadi. Rasmiy ma’lumotlarda muammoli kreditlar ulushi 1,5 foiz deb e’lon qilingan bo‘lsa-da, mustaqil baholarga ko‘ra u 8–12 foizni, XVJ bahosiga ko‘ra esa 15 foizni tashkil etgan</w:t>
+        <w:t xml:space="preserve">Biroq Xitoy tajribasi rasmiy ko‘rsatkichlarning ishonchliligi muammosini ham ochiq namoyon etadi. Bu muammo ilmiy adabiyotda ancha oldin qayd etilgan: 2010-yillarning o‘rtalarida rasmiy ma’lumotlarda muammoli kreditlar ulushi 1,5 foiz deb e’lon qilingan bo‘lsa-da, mustaqil baholarga ko‘ra u 8–12 foizni tashkil etgan</w:t>
       </w:r>
       <w:r>
         <w:rPr>
@@ -5465,14 +5465,74 @@
           <w:rFonts w:ascii="Times New Roman" w:hAnsi="Times New Roman" w:cs="Times New Roman" w:eastAsia="Times New Roman"/>
           <w:sz w:val="28"/>
         </w:rPr>
-        <w:t xml:space="preserve"> </w:t>
+        <w:t xml:space="preserve">. XVJ esa 2016-yilda Xitoy kompaniyalariga berilgan tijorat kreditlarining 15,5 foizi «risk ostida» ekanini va ular bo‘yicha potensial yo‘qotishlar YaIMning qariyb 7 foiziga teng bo‘lishi mumkinligini baholagan</w:t>
+      </w:r>
+      <w:r>
+        <w:rPr>
+          <w:rStyle w:val="FootnoteReference"/>
+        </w:rPr>
+        <w:footnoteReference w:id="62"/>
       </w:r>
       <w:r>
         <w:rPr>
           <w:rFonts w:ascii="Times New Roman" w:hAnsi="Times New Roman" w:cs="Times New Roman" w:eastAsia="Times New Roman"/>
           <w:sz w:val="28"/>
         </w:rPr>
-        <w:t xml:space="preserve">(1.3.7-rasm).</w:t>
+        <w:t xml:space="preserve">.</w:t>
+      </w:r>
+    </w:p>
+    <w:p>
+      <w:pPr>
+        <w:pStyle w:val="BodyText"/>
+        <w:spacing w:line="360" w:lineRule="auto" w:before="0" w:after="0"/>
+        <w:ind w:firstLine="709"/>
+        <w:jc w:val="both"/>
+      </w:pPr>
+      <w:r>
+        <w:rPr>
+          <w:rFonts w:ascii="Times New Roman" w:hAnsi="Times New Roman" w:cs="Times New Roman" w:eastAsia="Times New Roman"/>
+          <w:sz w:val="28"/>
+        </w:rPr>
+        <w:t xml:space="preserve">So‘nggi yillar ma’lumotlari ham vaziyat tubdan o‘zgarmaganini ko‘rsatadi. Milliy moliyaviy nazorat boshqarmasi ma’lumotlariga ko‘ra, tijorat banklarida muammoli kreditlar ulushi 2023-yil oxirida 1,59 foiz, 2024-yil oxirida 1,50 foiz, 2025-yil III chorak oxirida esa 1,52 foizni tashkil etgan</w:t>
+      </w:r>
+      <w:r>
+        <w:rPr>
+          <w:rStyle w:val="FootnoteReference"/>
+        </w:rPr>
+        <w:footnoteReference w:id="63"/>
+      </w:r>
+      <w:r>
+        <w:rPr>
+          <w:rFonts w:ascii="Times New Roman" w:hAnsi="Times New Roman" w:cs="Times New Roman" w:eastAsia="Times New Roman"/>
+          <w:sz w:val="28"/>
+        </w:rPr>
+        <w:t xml:space="preserve">. Biroq ularning yonida «alohida e’tibor talab qiluvchi» kreditlar ham bor bo‘lib, ularning ulushi 2,2 foiz atrofida saqlanib kelmoqda; ikkalasi qo‘shilganda muammoli aktivlar ulushi 3,7 foizga yetadi</w:t>
+      </w:r>
+      <w:r>
+        <w:rPr>
+          <w:rStyle w:val="FootnoteReference"/>
+        </w:rPr>
+        <w:footnoteReference w:id="64"/>
+      </w:r>
+      <w:r>
+        <w:rPr>
+          <w:rFonts w:ascii="Times New Roman" w:hAnsi="Times New Roman" w:cs="Times New Roman" w:eastAsia="Times New Roman"/>
+          <w:sz w:val="28"/>
+        </w:rPr>
+        <w:t xml:space="preserve">. B. Charoenwong, M. Miao va T. Ruan esa banklar muammoli kreditlarni o‘zlariga bog‘liq tomonlarga «sotib», ularning riskini amalda o‘zida qoldirayotganini aniqlagan. Mualliflar fikricha, shunday yashirin kreditlar hisobga olinsa, Xitoyda muammoli kreditlarning haqiqiy hajmi rasmiy ko‘rsatkichdan 2–3 barobar ko‘p bo‘ladi</w:t>
+      </w:r>
+      <w:r>
+        <w:rPr>
+          <w:rStyle w:val="FootnoteReference"/>
+        </w:rPr>
+        <w:footnoteReference w:id="65"/>
+      </w:r>
+      <w:r>
+        <w:rPr>
+          <w:rFonts w:ascii="Times New Roman" w:hAnsi="Times New Roman" w:cs="Times New Roman" w:eastAsia="Times New Roman"/>
+          <w:sz w:val="28"/>
+        </w:rPr>
+        <w:t xml:space="preserve">. Ushbu ma’lumotlar 1.3.7-rasmda umumlashtirildi.</w:t>
       </w:r>
     </w:p>
     <w:p>
@@ -5489,7 +5549,7 @@
         </w:rPr>
         <w:drawing>
           <wp:inline distT="0" distB="0" distL="0" distR="0">
-            <wp:extent cx="5400000" cy="2700000"/>
+            <wp:extent cx="5580000" cy="2592000"/>
             <wp:effectExtent l="0" t="0" r="0" b="0"/>
             <wp:docPr id="1007" name="1.3.7-rasm"/>
             <wp:cNvGraphicFramePr/>
@@ -5515,13 +5575,13 @@
           <w:b/>
           <w:sz w:val="28"/>
         </w:rPr>
-        <w:t xml:space="preserve">1.3.7-rasm. Xitoy bank tizimida muammoli kreditlar ulushining rasmiy va muqobil baholari, %</w:t>
-      </w:r>
-      <w:r>
-        <w:rPr>
-          <w:rStyle w:val="FootnoteReference"/>
-        </w:rPr>
-        <w:footnoteReference w:id="62"/>
+        <w:t xml:space="preserve">1.3.7-rasm. Xitoy tijorat banklarida muammoli kreditlar ulushi: rasmiy ma’lumotlar va muqobil baholar, %</w:t>
+      </w:r>
+      <w:r>
+        <w:rPr>
+          <w:rStyle w:val="FootnoteReference"/>
+        </w:rPr>
+        <w:footnoteReference w:id="66"/>
       </w:r>
     </w:p>
     <w:p>
@@ -5536,13 +5596,26 @@
           <w:rFonts w:ascii="Times New Roman" w:hAnsi="Times New Roman" w:cs="Times New Roman" w:eastAsia="Times New Roman"/>
           <w:sz w:val="28"/>
         </w:rPr>
-        <w:t xml:space="preserve">Rasmiy va muqobil baholar o‘rtasidagi o‘n barobardan ortiq tafovutning sababi nimada? He Wei Ping fikricha, davlatning yashirin kafolati, ya’ni «banklar qulashidan oldin qutqariladi» degan ishonch bozor intizomini zaiflashtiradi, tartibga solish maqsadlari esa hukumatning iqtisodiy va ijtimoiy siyosatiga bo‘ysundiriladi</w:t>
-      </w:r>
-      <w:r>
-        <w:rPr>
-          <w:rStyle w:val="FootnoteReference"/>
-        </w:rPr>
-        <w:footnoteReference w:id="63"/>
+        <w:t xml:space="preserve">Rasmdan ko‘rinadiki, rasmiy muammoli kreditlar ulushi uch yil davomida 1,5 foiz atrofida barqaror turibdi. Ammo alohida e’tibor talab qiluvchi kreditlar qo‘shilsa, bu ko‘rsatkich ikki yarim barobar, ilmiy baholarga ko‘ra esa uch barobargacha ortadi. XVJ ham 2025-yilgi sharhida ko‘chmas mulk, mahalliy hukumat moliyalashtirish kompaniyalari, o‘rta korxonalar va chakana qarz oluvchilarga berilgan imtiyozlar, ya’ni kredit muddatini uzaytirish va restrukturizatsiya qilish aktivlar sifatining haqiqiy holatini yashirishi hamda zararlarni tan olishni kechiktirishi mumkinligidan ogohlantirgan</w:t>
+      </w:r>
+      <w:r>
+        <w:rPr>
+          <w:rStyle w:val="FootnoteReference"/>
+        </w:rPr>
+        <w:footnoteReference w:id="67"/>
+      </w:r>
+      <w:r>
+        <w:rPr>
+          <w:rFonts w:ascii="Times New Roman" w:hAnsi="Times New Roman" w:cs="Times New Roman" w:eastAsia="Times New Roman"/>
+          <w:sz w:val="28"/>
+        </w:rPr>
+        <w:t xml:space="preserve">. Bunday tafovutning sababi nimada? He Wei Ping fikricha, davlatning yashirin kafolati, ya’ni «banklar qulashidan oldin qutqariladi» degan ishonch bozor intizomini zaiflashtiradi, tartibga solish maqsadlari esa hukumatning iqtisodiy va ijtimoiy siyosatiga bo‘ysundiriladi</w:t>
+      </w:r>
+      <w:r>
+        <w:rPr>
+          <w:rStyle w:val="FootnoteReference"/>
+        </w:rPr>
+        <w:footnoteReference w:id="68"/>
       </w:r>
       <w:r>
         <w:rPr>
@@ -5570,7 +5643,7 @@
         <w:rPr>
           <w:rStyle w:val="FootnoteReference"/>
         </w:rPr>
-        <w:footnoteReference w:id="64"/>
+        <w:footnoteReference w:id="69"/>
       </w:r>
       <w:r>
         <w:rPr>
@@ -5583,7 +5656,7 @@
         <w:rPr>
           <w:rStyle w:val="FootnoteReference"/>
         </w:rPr>
-        <w:footnoteReference w:id="65"/>
+        <w:footnoteReference w:id="70"/>
       </w:r>
       <w:r>
         <w:rPr>
@@ -5596,7 +5669,7 @@
         <w:rPr>
           <w:rStyle w:val="FootnoteReference"/>
         </w:rPr>
-        <w:footnoteReference w:id="66"/>
+        <w:footnoteReference w:id="71"/>
       </w:r>
       <w:r>
         <w:rPr>
@@ -5659,7 +5732,7 @@
         <w:rPr>
           <w:rStyle w:val="FootnoteReference"/>
         </w:rPr>
-        <w:footnoteReference w:id="67"/>
+        <w:footnoteReference w:id="72"/>
       </w:r>
     </w:p>
     <w:tbl>
@@ -6359,7 +6432,7 @@
         <w:t xml:space="preserve">Xorijiy mamlakatlar tajribasini tadqiq etgan holda xulosa qilish mumkinki, banklar moliyaviy barqarorligini baholashda reyting tizimlari, koeffitsiyentlar va guruhlab tahlil qilish tizimlari, risklarni kompleks baholash tizimlari hamda statistik modellardan iborat to‘rt turdagi yondashuv qo‘llanadi va rivojlangan mamlakatlarda ular bir-birini to‘ldirgan holda birgalikda ishlatiladi. AQSh tajribasi kapital ko‘rsatkichini pog‘onali shkala bilan baholab, uni majburiy nazorat choralari bilan bog‘lash, statistik modellar orqali bashorat aniqligini oshirish va stress-test natijalarini oshkor qilish samarali ekanini ko‘rsatdi. G‘arbiy Yevropa mamlakatlari nazorat intensivligini risk darajasiga bog‘lash va qiyosiy baholash afzalliklarini, Yevropa Ittifoqi esa mikro va makroprudensial nazoratni integratsiyalash hamda ochiq ma’lumotlar bazasini shakllantirish ahamiyatini namoyon etdi. Rossiya tajribasi ochiq vaznli ballik tizimning afzalliklari bilan birga uning dinamika va prognozni hisobga olmaslik kabi kamchiliklarini, Bazel III ni joriy etishda esa milliy bozorning tayyorligini inobatga olish zarurligini ochib berdi. Xitoy tajribasi davlat ulushi yuqori bo‘lgan tizimlarda rasmiy ko‘rsatkichlar ishonchliligi muammosini yaqqol ko‘rsatdi. Bu o‘z navbatida, O‘zbekistonda baholash natijalarini nazorat choralari bilan bog‘lash, baholash metodikasining shaffofligi va bashorat kuchini ta’minlash hamda aktivlar sifatini xalqaro standartlar asosida mustaqil baholash zaruriyatini yuzaga keltiradi. Ushbu yo‘nalishlar dissertatsiyaning III va IV boblarida ishlab chiqiladigan integral baholash metodikasi va erta ogohlantirish tizimining asosiy tamoyillari bo‘lib xizmat qiladi.</w:t>
       </w:r>
     </w:p>
-    <w:bookmarkEnd w:id="68"/>
+    <w:bookmarkEnd w:id="73"/>
     <w:sectPr>
       <w:pgMar w:left="1701" w:right="850" w:top="1134" w:bottom="1134"/>
     </w:sectPr>
@@ -7200,7 +7273,7 @@
         <w:t xml:space="preserve"> </w:t>
       </w:r>
       <w:r>
-        <w:t xml:space="preserve">Tadqiqot natijasida muallif tomonidan quyidagi manba ma’lumotlari asosida ishlab chiqildi: О приведении банковского регулирования в соответствие со стандартами Базельского комитета по банковскому надзору (Базель III) в условиях нестабильной экономической ситуации: монография / под ред. И.В. Ларионовой. – М.: КНОРУС. – С. 142–144.</w:t>
+        <w:t xml:space="preserve">International Monetary Fund. Global Financial Stability Report: Potent Policies for a Successful Normalization. – Washington, DC: IMF, April 2016.</w:t>
       </w:r>
     </w:p>
   </w:footnote>
@@ -7219,7 +7292,7 @@
         <w:t xml:space="preserve"> </w:t>
       </w:r>
       <w:r>
-        <w:t xml:space="preserve">He Wei Ping. Banking Regulation in China: The Role of Public and Private Sectors. – New York: Palgrave Macmillan, 2014. – P. 68, 135.</w:t>
+        <w:t xml:space="preserve">National Financial Regulatory Administration. Supervisory Statistics of the Banking and Insurance Sectors: 2023-yil IV chorak, 2024-yil IV chorak, 2025-yil III chorak. – https://www.nfra.gov.cn/en/</w:t>
       </w:r>
     </w:p>
   </w:footnote>
@@ -7238,7 +7311,7 @@
         <w:t xml:space="preserve"> </w:t>
       </w:r>
       <w:r>
-        <w:t xml:space="preserve">О приведении банковского регулирования в соответствие со стандартами Базельского комитета по банковскому надзору (Базель III) в условиях нестабильной экономической ситуации: монография / под ред. И.В. Ларионовой. – М.: КНОРУС. – С. 118–124.</w:t>
+        <w:t xml:space="preserve">International Monetary Fund. People’s Republic of China: 2025 Article IV Consultation – Press Release; Staff Report; and Statement by the Executive Director. IMF Country Report No. 26/44. – Washington, DC: IMF, 2026.</w:t>
       </w:r>
     </w:p>
   </w:footnote>
@@ -7257,7 +7330,7 @@
         <w:t xml:space="preserve"> </w:t>
       </w:r>
       <w:r>
-        <w:t xml:space="preserve">О приведении банковского регулирования в соответствие со стандартами Базельского комитета по банковскому надзору (Базель III) в условиях нестабильной экономической ситуации: монография / под ред. И.В. Ларионовой. – М.: КНОРУС. – С. 138–140.</w:t>
+        <w:t xml:space="preserve">Charoenwong B., Miao M., Ruan T. Nonperforming Loan Disposals Without Resolution // Management Science. – 2025. – Vol. 71, No. 1. – P. 898–916.</w:t>
       </w:r>
     </w:p>
   </w:footnote>
@@ -7276,11 +7349,106 @@
         <w:t xml:space="preserve"> </w:t>
       </w:r>
       <w:r>
-        <w:t xml:space="preserve">О приведении банковского регулирования в соответствие со стандартами Базельского комитета по банковскому надзору (Базель III) в условиях нестабильной экономической ситуации: монография / под ред. И.В. Ларионовой. – М.: КНОРУС. – С. 134.</w:t>
+        <w:t xml:space="preserve">Tadqiqot natijasida muallif tomonidan quyidagi manbalar ma’lumotlari asosida ishlab chiqildi: National Financial Regulatory Administration. Supervisory Statistics of the Banking and Insurance Sectors: 2023-yil IV chorak, 2024-yil IV chorak, 2025-yil III chorak. – https://www.nfra.gov.cn/en; International Monetary Fund. People’s Republic of China: 2025 Article IV Consultation – Press Release; Staff Report; and Statement by the Executive Director. IMF Country Report No. 26/44. – Washington, DC: IMF, 2026; Charoenwong B., Miao M., Ruan T. Nonperforming Loan Disposals Without Resolution // Management Science. – 2025. – Vol. 71, No. 1. – P. 898–916; International Monetary Fund. Global Financial Stability Report: Potent Policies for a Successful Normalization. – Washington, DC: IMF, April 2016.</w:t>
       </w:r>
     </w:p>
   </w:footnote>
   <w:footnote w:id="67">
+    <w:p>
+      <w:pPr>
+        <w:pStyle w:val="FootnoteText"/>
+      </w:pPr>
+      <w:r>
+        <w:rPr>
+          <w:rStyle w:val="FootnoteReference"/>
+        </w:rPr>
+        <w:footnoteRef/>
+      </w:r>
+      <w:r>
+        <w:t xml:space="preserve"> </w:t>
+      </w:r>
+      <w:r>
+        <w:t xml:space="preserve">International Monetary Fund. People’s Republic of China: 2025 Article IV Consultation – Press Release; Staff Report; and Statement by the Executive Director. IMF Country Report No. 26/44. – Washington, DC: IMF, 2026.</w:t>
+      </w:r>
+    </w:p>
+  </w:footnote>
+  <w:footnote w:id="68">
+    <w:p>
+      <w:pPr>
+        <w:pStyle w:val="FootnoteText"/>
+      </w:pPr>
+      <w:r>
+        <w:rPr>
+          <w:rStyle w:val="FootnoteReference"/>
+        </w:rPr>
+        <w:footnoteRef/>
+      </w:r>
+      <w:r>
+        <w:t xml:space="preserve"> </w:t>
+      </w:r>
+      <w:r>
+        <w:t xml:space="preserve">He Wei Ping. Banking Regulation in China: The Role of Public and Private Sectors. – New York: Palgrave Macmillan, 2014. – P. 68, 135.</w:t>
+      </w:r>
+    </w:p>
+  </w:footnote>
+  <w:footnote w:id="69">
+    <w:p>
+      <w:pPr>
+        <w:pStyle w:val="FootnoteText"/>
+      </w:pPr>
+      <w:r>
+        <w:rPr>
+          <w:rStyle w:val="FootnoteReference"/>
+        </w:rPr>
+        <w:footnoteRef/>
+      </w:r>
+      <w:r>
+        <w:t xml:space="preserve"> </w:t>
+      </w:r>
+      <w:r>
+        <w:t xml:space="preserve">О приведении банковского регулирования в соответствие со стандартами Базельского комитета по банковскому надзору (Базель III) в условиях нестабильной экономической ситуации: монография / под ред. И.В. Ларионовой. – М.: КНОРУС. – С. 118–124.</w:t>
+      </w:r>
+    </w:p>
+  </w:footnote>
+  <w:footnote w:id="70">
+    <w:p>
+      <w:pPr>
+        <w:pStyle w:val="FootnoteText"/>
+      </w:pPr>
+      <w:r>
+        <w:rPr>
+          <w:rStyle w:val="FootnoteReference"/>
+        </w:rPr>
+        <w:footnoteRef/>
+      </w:r>
+      <w:r>
+        <w:t xml:space="preserve"> </w:t>
+      </w:r>
+      <w:r>
+        <w:t xml:space="preserve">О приведении банковского регулирования в соответствие со стандартами Базельского комитета по банковскому надзору (Базель III) в условиях нестабильной экономической ситуации: монография / под ред. И.В. Ларионовой. – М.: КНОРУС. – С. 138–140.</w:t>
+      </w:r>
+    </w:p>
+  </w:footnote>
+  <w:footnote w:id="71">
+    <w:p>
+      <w:pPr>
+        <w:pStyle w:val="FootnoteText"/>
+      </w:pPr>
+      <w:r>
+        <w:rPr>
+          <w:rStyle w:val="FootnoteReference"/>
+        </w:rPr>
+        <w:footnoteRef/>
+      </w:r>
+      <w:r>
+        <w:t xml:space="preserve"> </w:t>
+      </w:r>
+      <w:r>
+        <w:t xml:space="preserve">О приведении банковского регулирования в соответствие со стандартами Базельского комитета по банковскому надзору (Базель III) в условиях нестабильной экономической ситуации: монография / под ред. И.В. Ларионовой. – М.: КНОРУС. – С. 134.</w:t>
+      </w:r>
+    </w:p>
+  </w:footnote>
+  <w:footnote w:id="72">
     <w:p>
       <w:pPr>
         <w:pStyle w:val="FootnoteText"/>
@@ -9019,7 +9187,7 @@
       <c:layout/>
       <c:barChart>
         <c:barDir val="col"/>
-        <c:grouping val="clustered"/>
+        <c:grouping val="stacked"/>
         <c:varyColors val="0"/>
         <c:ser>
           <c:idx val="0"/>
@@ -9030,7 +9198,7 @@
               <c:strCache>
                 <c:ptCount val="1"/>
                 <c:pt idx="0">
-                  <c:v>Muammoli kreditlar ulushi</c:v>
+                  <c:v>Muammoli kreditlar</c:v>
                 </c:pt>
               </c:strCache>
             </c:strRef>
@@ -9047,7 +9215,112 @@
           </c:spPr>
           <c:invertIfNegative val="0"/>
           <c:dLbls>
-            <c:numFmt formatCode="0.0" sourceLinked="0"/>
+            <c:numFmt formatCode="0.00" sourceLinked="0"/>
+            <c:spPr>
+              <a:noFill/>
+              <a:ln>
+                <a:noFill/>
+              </a:ln>
+            </c:spPr>
+            <c:txPr>
+              <a:bodyPr/>
+              <a:lstStyle/>
+              <a:p>
+                <a:pPr>
+                  <a:defRPr sz="1050" b="1">
+                    <a:solidFill>
+                      <a:srgbClr val="FFFFFF"/>
+                    </a:solidFill>
+                    <a:latin typeface="Times New Roman"/>
+                    <a:cs typeface="Times New Roman"/>
+                  </a:defRPr>
+                </a:pPr>
+                <a:endParaRPr lang="uz-Latn-UZ"/>
+              </a:p>
+            </c:txPr>
+            <c:dLblPos val="ctr"/>
+            <c:showLegendKey val="0"/>
+            <c:showVal val="1"/>
+            <c:showCatName val="0"/>
+            <c:showSerName val="0"/>
+            <c:showPercent val="0"/>
+            <c:showBubbleSize val="0"/>
+          </c:dLbls>
+          <c:cat>
+            <c:strRef>
+              <c:f>Sheet1!$A$2:$A$7</c:f>
+              <c:strCache>
+                <c:ptCount val="6"/>
+                <c:pt idx="0">
+                  <c:v>2023-y. oxiri</c:v>
+                </c:pt>
+                <c:pt idx="1">
+                  <c:v>2024-y. oxiri</c:v>
+                </c:pt>
+                <c:pt idx="2">
+                  <c:v>2025-y. III chorak</c:v>
+                </c:pt>
+                <c:pt idx="3">
+                  <c:v>Ilmiy baho:
+quyi chegara</c:v>
+                </c:pt>
+                <c:pt idx="4">
+                  <c:v>Ilmiy baho:
+yuqori chegara</c:v>
+                </c:pt>
+                <c:pt idx="5">
+                  <c:v>XVJ: risk ostidagi
+kreditlar (2016)</c:v>
+                </c:pt>
+              </c:strCache>
+            </c:strRef>
+          </c:cat>
+          <c:val>
+            <c:numRef>
+              <c:f>Sheet1!$B$2:$B$7</c:f>
+              <c:numCache>
+                <c:formatCode>General</c:formatCode>
+                <c:ptCount val="6"/>
+                <c:pt idx="0">
+                  <c:v>1.59</c:v>
+                </c:pt>
+                <c:pt idx="1">
+                  <c:v>1.5</c:v>
+                </c:pt>
+                <c:pt idx="2">
+                  <c:v>1.52</c:v>
+                </c:pt>
+              </c:numCache>
+            </c:numRef>
+          </c:val>
+        </c:ser>
+        <c:ser>
+          <c:idx val="1"/>
+          <c:order val="1"/>
+          <c:tx>
+            <c:strRef>
+              <c:f>Sheet1!$C$1</c:f>
+              <c:strCache>
+                <c:ptCount val="1"/>
+                <c:pt idx="0">
+                  <c:v>Alohida e’tibor talab qiluvchi kreditlar</c:v>
+                </c:pt>
+              </c:strCache>
+            </c:strRef>
+          </c:tx>
+          <c:spPr>
+            <a:solidFill>
+              <a:srgbClr val="FFC000"/>
+            </a:solidFill>
+            <a:ln w="6350">
+              <a:solidFill>
+                <a:srgbClr val="FFFFFF"/>
+              </a:solidFill>
+            </a:ln>
+          </c:spPr>
+          <c:invertIfNegative val="0"/>
+          <c:dLbls>
+            <c:numFmt formatCode="0.00" sourceLinked="0"/>
             <c:spPr>
               <a:noFill/>
               <a:ln>
@@ -9070,7 +9343,7 @@
                 <a:endParaRPr lang="uz-Latn-UZ"/>
               </a:p>
             </c:txPr>
-            <c:dLblPos val="outEnd"/>
+            <c:dLblPos val="ctr"/>
             <c:showLegendKey val="0"/>
             <c:showVal val="1"/>
             <c:showCatName val="0"/>
@@ -9080,49 +9353,159 @@
           </c:dLbls>
           <c:cat>
             <c:strRef>
-              <c:f>Sheet1!$A$2:$A$5</c:f>
+              <c:f>Sheet1!$A$2:$A$7</c:f>
               <c:strCache>
-                <c:ptCount val="4"/>
+                <c:ptCount val="6"/>
                 <c:pt idx="0">
-                  <c:v>Rasmiy ma’lumot</c:v>
+                  <c:v>2023-y. oxiri</c:v>
                 </c:pt>
                 <c:pt idx="1">
-                  <c:v>Mustaqil baho
-(quyi chegara)</c:v>
+                  <c:v>2024-y. oxiri</c:v>
                 </c:pt>
                 <c:pt idx="2">
-                  <c:v>Mustaqil baho
-(yuqori chegara)</c:v>
+                  <c:v>2025-y. III chorak</c:v>
                 </c:pt>
                 <c:pt idx="3">
-                  <c:v>XVJ bahosi</c:v>
+                  <c:v>Ilmiy baho:
+quyi chegara</c:v>
+                </c:pt>
+                <c:pt idx="4">
+                  <c:v>Ilmiy baho:
+yuqori chegara</c:v>
+                </c:pt>
+                <c:pt idx="5">
+                  <c:v>XVJ: risk ostidagi
+kreditlar (2016)</c:v>
                 </c:pt>
               </c:strCache>
             </c:strRef>
           </c:cat>
           <c:val>
             <c:numRef>
-              <c:f>Sheet1!$B$2:$B$5</c:f>
+              <c:f>Sheet1!$C$2:$C$7</c:f>
               <c:numCache>
                 <c:formatCode>General</c:formatCode>
-                <c:ptCount val="4"/>
+                <c:ptCount val="6"/>
                 <c:pt idx="0">
-                  <c:v>1.5</c:v>
+                  <c:v>2.2</c:v>
                 </c:pt>
                 <c:pt idx="1">
-                  <c:v>8</c:v>
+                  <c:v>2.22</c:v>
                 </c:pt>
                 <c:pt idx="2">
-                  <c:v>12</c:v>
-                </c:pt>
-                <c:pt idx="3">
-                  <c:v>15</c:v>
+                  <c:v>2.2</c:v>
                 </c:pt>
               </c:numCache>
             </c:numRef>
           </c:val>
         </c:ser>
-        <c:gapWidth val="60"/>
+        <c:ser>
+          <c:idx val="2"/>
+          <c:order val="2"/>
+          <c:tx>
+            <c:strRef>
+              <c:f>Sheet1!$D$1</c:f>
+              <c:strCache>
+                <c:ptCount val="1"/>
+                <c:pt idx="0">
+                  <c:v>Muqobil baholar</c:v>
+                </c:pt>
+              </c:strCache>
+            </c:strRef>
+          </c:tx>
+          <c:spPr>
+            <a:solidFill>
+              <a:srgbClr val="EB6834"/>
+            </a:solidFill>
+            <a:ln w="6350">
+              <a:solidFill>
+                <a:srgbClr val="FFFFFF"/>
+              </a:solidFill>
+            </a:ln>
+          </c:spPr>
+          <c:invertIfNegative val="0"/>
+          <c:dLbls>
+            <c:numFmt formatCode="0.00" sourceLinked="0"/>
+            <c:spPr>
+              <a:noFill/>
+              <a:ln>
+                <a:noFill/>
+              </a:ln>
+            </c:spPr>
+            <c:txPr>
+              <a:bodyPr/>
+              <a:lstStyle/>
+              <a:p>
+                <a:pPr>
+                  <a:defRPr sz="1050" b="1">
+                    <a:solidFill>
+                      <a:srgbClr val="000000"/>
+                    </a:solidFill>
+                    <a:latin typeface="Times New Roman"/>
+                    <a:cs typeface="Times New Roman"/>
+                  </a:defRPr>
+                </a:pPr>
+                <a:endParaRPr lang="uz-Latn-UZ"/>
+              </a:p>
+            </c:txPr>
+            <c:dLblPos val="ctr"/>
+            <c:showLegendKey val="0"/>
+            <c:showVal val="1"/>
+            <c:showCatName val="0"/>
+            <c:showSerName val="0"/>
+            <c:showPercent val="0"/>
+            <c:showBubbleSize val="0"/>
+          </c:dLbls>
+          <c:cat>
+            <c:strRef>
+              <c:f>Sheet1!$A$2:$A$7</c:f>
+              <c:strCache>
+                <c:ptCount val="6"/>
+                <c:pt idx="0">
+                  <c:v>2023-y. oxiri</c:v>
+                </c:pt>
+                <c:pt idx="1">
+                  <c:v>2024-y. oxiri</c:v>
+                </c:pt>
+                <c:pt idx="2">
+                  <c:v>2025-y. III chorak</c:v>
+                </c:pt>
+                <c:pt idx="3">
+                  <c:v>Ilmiy baho:
+quyi chegara</c:v>
+                </c:pt>
+                <c:pt idx="4">
+                  <c:v>Ilmiy baho:
+yuqori chegara</c:v>
+                </c:pt>
+                <c:pt idx="5">
+                  <c:v>XVJ: risk ostidagi
+kreditlar (2016)</c:v>
+                </c:pt>
+              </c:strCache>
+            </c:strRef>
+          </c:cat>
+          <c:val>
+            <c:numRef>
+              <c:f>Sheet1!$D$2:$D$7</c:f>
+              <c:numCache>
+                <c:formatCode>General</c:formatCode>
+                <c:ptCount val="6"/>
+                <c:pt idx="3">
+                  <c:v>3.0</c:v>
+                </c:pt>
+                <c:pt idx="4">
+                  <c:v>4.6</c:v>
+                </c:pt>
+                <c:pt idx="5">
+                  <c:v>15.5</c:v>
+                </c:pt>
+              </c:numCache>
+            </c:numRef>
+          </c:val>
+        </c:ser>
+        <c:gapWidth val="50"/>
+        <c:overlap val="100"/>
         <c:axId val="111"/>
         <c:axId val="222"/>
       </c:barChart>
@@ -9253,6 +9636,26 @@
         </a:ln>
       </c:spPr>
     </c:plotArea>
+    <c:legend>
+      <c:legendPos val="b"/>
+      <c:overlay val="0"/>
+      <c:txPr>
+        <a:bodyPr/>
+        <a:lstStyle/>
+        <a:p>
+          <a:pPr>
+            <a:defRPr sz="1050" b="0">
+              <a:solidFill>
+                <a:srgbClr val="000000"/>
+              </a:solidFill>
+              <a:latin typeface="Times New Roman"/>
+              <a:cs typeface="Times New Roman"/>
+            </a:defRPr>
+          </a:pPr>
+          <a:endParaRPr lang="uz-Latn-UZ"/>
+        </a:p>
+      </c:txPr>
+    </c:legend>
     <c:plotVisOnly val="1"/>
     <c:dispBlanksAs val="gap"/>
   </c:chart>

</xml_diff>

<commit_message>
1.3.5-rasm: ustma-ust chiziqlar o‘rniga ustunli diagramma, matn aniqlashtirildi
Co-Authored-By: Claude Opus 5.5 <noreply@anthropic.com>
Claude-Session: https://claude.ai/code/session_01PxHTC8Q7yHdrpAeUA5KUgM
</commit_message>
<xml_diff>
--- a/paragraflar/1.3-xorijiy-tajriba.docx
+++ b/paragraflar/1.3-xorijiy-tajriba.docx
@@ -4314,7 +4314,7 @@
           <w:rFonts w:ascii="Times New Roman" w:hAnsi="Times New Roman" w:cs="Times New Roman" w:eastAsia="Times New Roman"/>
           <w:sz w:val="28"/>
         </w:rPr>
-        <w:t xml:space="preserve">. Ushbu jadvalni Bazel qo‘mitasining standart jadvali va O‘zbekiston jadvali bilan solishtirish Rossiya sekinroq yo‘ldan borganini ko‘rsatadi (1.3.5-rasm).</w:t>
+        <w:t xml:space="preserve">. Ushbu jadvalni Bazel qo‘mitasining standart jadvali va O‘zbekiston jadvali bilan solishtirish qiziqarli manzarani beradi (1.3.5-rasm).</w:t>
       </w:r>
     </w:p>
     <w:p>
@@ -4378,7 +4378,7 @@
           <w:rFonts w:ascii="Times New Roman" w:hAnsi="Times New Roman" w:cs="Times New Roman" w:eastAsia="Times New Roman"/>
           <w:sz w:val="28"/>
         </w:rPr>
-        <w:t xml:space="preserve">Rasmdan ko‘rinadiki, Bazel qo‘mitasi ushbu koeffitsiyentni 60 foizdan boshlab besh yilda to‘liq joriy etishni ko‘zda tutgan. Rossiya undan bir yil kechikib, lekin yuqoriroq boshlang‘ich darajadan boshlagan bo‘lsa, O‘zbekiston 80 foizdan boshlab uch yil ichida 100 foizga yetgan. Rossiyaning ehtiyotkorligi asossiz emas edi. 2015-yil oktabrida tizimli ahamiyatli banklarda bu ko‘rsatkich atigi 59,9 foizni tashkil etgan, 100 foizga yetish uchun esa 2 trln rubllik Markaziy bank kredit liniyalari zarur bo‘lgan; yuqori sifatli likvid aktivlarning 19 toifasidan mahalliy bozorda faqat 4 tasi mavjud edi</w:t>
+        <w:t xml:space="preserve">Rasmdan ko‘rinadiki, Bazel qo‘mitasi ushbu koeffitsiyentni 2015-yilda 60 foizdan boshlab besh yilda to‘liq joriy etishni ko‘zda tutgan. Rossiya birinchi bosqichni o‘tkazib yuborib, 2016-yildan boshlab Bazel jadvaliga qo‘shilgan va 2019-yilda 100 foizga yetgan, biroq bu talabni faqat tizimli ahamiyatli banklarga nisbatan qo‘llagan. O‘zbekiston esa 80 foizdan boshlab, Bazel muddatidan bir yil oldin, ya’ni 2018-yildayoq 100 foizga yetgan. Rossiyaning ehtiyotkorligi asossiz emas edi. 2015-yil oktabrida tizimli ahamiyatli banklarda bu ko‘rsatkich atigi 59,9 foizni tashkil etgan, 100 foizga yetish uchun esa 2 trln rubllik Markaziy bank kredit liniyalari zarur bo‘lgan; yuqori sifatli likvid aktivlarning 19 toifasidan mahalliy bozorda faqat 4 tasi mavjud edi</w:t>
       </w:r>
       <w:r>
         <w:rPr>
@@ -8730,8 +8730,9 @@
     <c:autoTitleDeleted val="1"/>
     <c:plotArea>
       <c:layout/>
-      <c:scatterChart>
-        <c:scatterStyle val="lineMarker"/>
+      <c:barChart>
+        <c:barDir val="col"/>
+        <c:grouping val="clustered"/>
         <c:varyColors val="0"/>
         <c:ser>
           <c:idx val="0"/>
@@ -8748,29 +8749,52 @@
             </c:strRef>
           </c:tx>
           <c:spPr>
-            <a:ln w="28575">
+            <a:solidFill>
+              <a:srgbClr val="2A78D6"/>
+            </a:solidFill>
+            <a:ln w="6350">
               <a:solidFill>
-                <a:srgbClr val="2A78D6"/>
+                <a:srgbClr val="FFFFFF"/>
               </a:solidFill>
             </a:ln>
           </c:spPr>
-          <c:marker>
-            <c:symbol val="circle"/>
-            <c:size val="7"/>
+          <c:invertIfNegative val="0"/>
+          <c:dLbls>
+            <c:numFmt formatCode="0" sourceLinked="0"/>
             <c:spPr>
-              <a:solidFill>
-                <a:srgbClr val="2A78D6"/>
-              </a:solidFill>
+              <a:noFill/>
               <a:ln>
                 <a:noFill/>
               </a:ln>
             </c:spPr>
-          </c:marker>
-          <c:xVal>
-            <c:numRef>
+            <c:txPr>
+              <a:bodyPr/>
+              <a:lstStyle/>
+              <a:p>
+                <a:pPr>
+                  <a:defRPr sz="1050" b="1">
+                    <a:solidFill>
+                      <a:srgbClr val="000000"/>
+                    </a:solidFill>
+                    <a:latin typeface="Times New Roman"/>
+                    <a:cs typeface="Times New Roman"/>
+                  </a:defRPr>
+                </a:pPr>
+                <a:endParaRPr lang="uz-Latn-UZ"/>
+              </a:p>
+            </c:txPr>
+            <c:dLblPos val="outEnd"/>
+            <c:showLegendKey val="0"/>
+            <c:showVal val="1"/>
+            <c:showCatName val="0"/>
+            <c:showSerName val="0"/>
+            <c:showPercent val="0"/>
+            <c:showBubbleSize val="0"/>
+          </c:dLbls>
+          <c:cat>
+            <c:strRef>
               <c:f>Sheet1!$A$2:$A$6</c:f>
-              <c:numCache>
-                <c:formatCode>General</c:formatCode>
+              <c:strCache>
                 <c:ptCount val="5"/>
                 <c:pt idx="0">
                   <c:v>2015</c:v>
@@ -8787,10 +8811,10 @@
                 <c:pt idx="4">
                   <c:v>2019</c:v>
                 </c:pt>
-              </c:numCache>
-            </c:numRef>
-          </c:xVal>
-          <c:yVal>
+              </c:strCache>
+            </c:strRef>
+          </c:cat>
+          <c:val>
             <c:numRef>
               <c:f>Sheet1!$B$2:$B$6</c:f>
               <c:numCache>
@@ -8813,72 +8837,196 @@
                 </c:pt>
               </c:numCache>
             </c:numRef>
-          </c:yVal>
-          <c:smooth val="0"/>
+          </c:val>
         </c:ser>
         <c:ser>
           <c:idx val="1"/>
           <c:order val="1"/>
           <c:tx>
             <c:strRef>
-              <c:f>Sheet1!$D$1</c:f>
+              <c:f>Sheet1!$C$1</c:f>
               <c:strCache>
                 <c:ptCount val="1"/>
                 <c:pt idx="0">
-                  <c:v>Rossiya (tizimli banklar)</c:v>
+                  <c:v>Rossiya (tizimli ahamiyatli banklar)</c:v>
                 </c:pt>
               </c:strCache>
             </c:strRef>
           </c:tx>
           <c:spPr>
-            <a:ln w="28575">
+            <a:solidFill>
+              <a:srgbClr val="EB6834"/>
+            </a:solidFill>
+            <a:ln w="6350">
               <a:solidFill>
-                <a:srgbClr val="EB6834"/>
+                <a:srgbClr val="FFFFFF"/>
               </a:solidFill>
             </a:ln>
           </c:spPr>
-          <c:marker>
-            <c:symbol val="square"/>
-            <c:size val="7"/>
+          <c:invertIfNegative val="0"/>
+          <c:dLbls>
+            <c:numFmt formatCode="0" sourceLinked="0"/>
             <c:spPr>
-              <a:solidFill>
-                <a:srgbClr val="EB6834"/>
-              </a:solidFill>
+              <a:noFill/>
               <a:ln>
                 <a:noFill/>
               </a:ln>
             </c:spPr>
-          </c:marker>
-          <c:xVal>
+            <c:txPr>
+              <a:bodyPr/>
+              <a:lstStyle/>
+              <a:p>
+                <a:pPr>
+                  <a:defRPr sz="1050" b="1">
+                    <a:solidFill>
+                      <a:srgbClr val="000000"/>
+                    </a:solidFill>
+                    <a:latin typeface="Times New Roman"/>
+                    <a:cs typeface="Times New Roman"/>
+                  </a:defRPr>
+                </a:pPr>
+                <a:endParaRPr lang="uz-Latn-UZ"/>
+              </a:p>
+            </c:txPr>
+            <c:dLblPos val="outEnd"/>
+            <c:showLegendKey val="0"/>
+            <c:showVal val="1"/>
+            <c:showCatName val="0"/>
+            <c:showSerName val="0"/>
+            <c:showPercent val="0"/>
+            <c:showBubbleSize val="0"/>
+          </c:dLbls>
+          <c:cat>
+            <c:strRef>
+              <c:f>Sheet1!$A$2:$A$6</c:f>
+              <c:strCache>
+                <c:ptCount val="5"/>
+                <c:pt idx="0">
+                  <c:v>2015</c:v>
+                </c:pt>
+                <c:pt idx="1">
+                  <c:v>2016</c:v>
+                </c:pt>
+                <c:pt idx="2">
+                  <c:v>2017</c:v>
+                </c:pt>
+                <c:pt idx="3">
+                  <c:v>2018</c:v>
+                </c:pt>
+                <c:pt idx="4">
+                  <c:v>2019</c:v>
+                </c:pt>
+              </c:strCache>
+            </c:strRef>
+          </c:cat>
+          <c:val>
             <c:numRef>
-              <c:f>Sheet1!$C$2:$C$5</c:f>
+              <c:f>Sheet1!$C$2:$C$6</c:f>
               <c:numCache>
                 <c:formatCode>General</c:formatCode>
-                <c:ptCount val="4"/>
-                <c:pt idx="0">
-                  <c:v>2016</c:v>
-                </c:pt>
+                <c:ptCount val="5"/>
                 <c:pt idx="1">
-                  <c:v>2017</c:v>
+                  <c:v>70</c:v>
                 </c:pt>
                 <c:pt idx="2">
-                  <c:v>2018</c:v>
+                  <c:v>80</c:v>
                 </c:pt>
                 <c:pt idx="3">
-                  <c:v>2019</c:v>
+                  <c:v>90</c:v>
+                </c:pt>
+                <c:pt idx="4">
+                  <c:v>100</c:v>
                 </c:pt>
               </c:numCache>
             </c:numRef>
-          </c:xVal>
-          <c:yVal>
+          </c:val>
+        </c:ser>
+        <c:ser>
+          <c:idx val="2"/>
+          <c:order val="2"/>
+          <c:tx>
+            <c:strRef>
+              <c:f>Sheet1!$D$1</c:f>
+              <c:strCache>
+                <c:ptCount val="1"/>
+                <c:pt idx="0">
+                  <c:v>O‘zbekiston</c:v>
+                </c:pt>
+              </c:strCache>
+            </c:strRef>
+          </c:tx>
+          <c:spPr>
+            <a:solidFill>
+              <a:srgbClr val="70AD47"/>
+            </a:solidFill>
+            <a:ln w="6350">
+              <a:solidFill>
+                <a:srgbClr val="FFFFFF"/>
+              </a:solidFill>
+            </a:ln>
+          </c:spPr>
+          <c:invertIfNegative val="0"/>
+          <c:dLbls>
+            <c:numFmt formatCode="0" sourceLinked="0"/>
+            <c:spPr>
+              <a:noFill/>
+              <a:ln>
+                <a:noFill/>
+              </a:ln>
+            </c:spPr>
+            <c:txPr>
+              <a:bodyPr/>
+              <a:lstStyle/>
+              <a:p>
+                <a:pPr>
+                  <a:defRPr sz="1050" b="1">
+                    <a:solidFill>
+                      <a:srgbClr val="000000"/>
+                    </a:solidFill>
+                    <a:latin typeface="Times New Roman"/>
+                    <a:cs typeface="Times New Roman"/>
+                  </a:defRPr>
+                </a:pPr>
+                <a:endParaRPr lang="uz-Latn-UZ"/>
+              </a:p>
+            </c:txPr>
+            <c:dLblPos val="outEnd"/>
+            <c:showLegendKey val="0"/>
+            <c:showVal val="1"/>
+            <c:showCatName val="0"/>
+            <c:showSerName val="0"/>
+            <c:showPercent val="0"/>
+            <c:showBubbleSize val="0"/>
+          </c:dLbls>
+          <c:cat>
+            <c:strRef>
+              <c:f>Sheet1!$A$2:$A$6</c:f>
+              <c:strCache>
+                <c:ptCount val="5"/>
+                <c:pt idx="0">
+                  <c:v>2015</c:v>
+                </c:pt>
+                <c:pt idx="1">
+                  <c:v>2016</c:v>
+                </c:pt>
+                <c:pt idx="2">
+                  <c:v>2017</c:v>
+                </c:pt>
+                <c:pt idx="3">
+                  <c:v>2018</c:v>
+                </c:pt>
+                <c:pt idx="4">
+                  <c:v>2019</c:v>
+                </c:pt>
+              </c:strCache>
+            </c:strRef>
+          </c:cat>
+          <c:val>
             <c:numRef>
-              <c:f>Sheet1!$D$2:$D$5</c:f>
+              <c:f>Sheet1!$D$2:$D$6</c:f>
               <c:numCache>
                 <c:formatCode>General</c:formatCode>
-                <c:ptCount val="4"/>
-                <c:pt idx="0">
-                  <c:v>70</c:v>
-                </c:pt>
+                <c:ptCount val="5"/>
                 <c:pt idx="1">
                   <c:v>80</c:v>
                 </c:pt>
@@ -8888,91 +9036,21 @@
                 <c:pt idx="3">
                   <c:v>100</c:v>
                 </c:pt>
-              </c:numCache>
-            </c:numRef>
-          </c:yVal>
-          <c:smooth val="0"/>
-        </c:ser>
-        <c:ser>
-          <c:idx val="2"/>
-          <c:order val="2"/>
-          <c:tx>
-            <c:strRef>
-              <c:f>Sheet1!$F$1</c:f>
-              <c:strCache>
-                <c:ptCount val="1"/>
-                <c:pt idx="0">
-                  <c:v>O‘zbekiston</c:v>
-                </c:pt>
-              </c:strCache>
-            </c:strRef>
-          </c:tx>
-          <c:spPr>
-            <a:ln w="28575">
-              <a:solidFill>
-                <a:srgbClr val="70AD47"/>
-              </a:solidFill>
-            </a:ln>
-          </c:spPr>
-          <c:marker>
-            <c:symbol val="triangle"/>
-            <c:size val="7"/>
-            <c:spPr>
-              <a:solidFill>
-                <a:srgbClr val="70AD47"/>
-              </a:solidFill>
-              <a:ln>
-                <a:noFill/>
-              </a:ln>
-            </c:spPr>
-          </c:marker>
-          <c:xVal>
-            <c:numRef>
-              <c:f>Sheet1!$E$2:$E$4</c:f>
-              <c:numCache>
-                <c:formatCode>General</c:formatCode>
-                <c:ptCount val="3"/>
-                <c:pt idx="0">
-                  <c:v>2016</c:v>
-                </c:pt>
-                <c:pt idx="1">
-                  <c:v>2017</c:v>
-                </c:pt>
-                <c:pt idx="2">
-                  <c:v>2018</c:v>
-                </c:pt>
-              </c:numCache>
-            </c:numRef>
-          </c:xVal>
-          <c:yVal>
-            <c:numRef>
-              <c:f>Sheet1!$F$2:$F$4</c:f>
-              <c:numCache>
-                <c:formatCode>General</c:formatCode>
-                <c:ptCount val="3"/>
-                <c:pt idx="0">
-                  <c:v>80</c:v>
-                </c:pt>
-                <c:pt idx="1">
-                  <c:v>90</c:v>
-                </c:pt>
-                <c:pt idx="2">
+                <c:pt idx="4">
                   <c:v>100</c:v>
                 </c:pt>
               </c:numCache>
             </c:numRef>
-          </c:yVal>
-          <c:smooth val="0"/>
+          </c:val>
         </c:ser>
-        <c:axId val="333"/>
-        <c:axId val="444"/>
-      </c:scatterChart>
-      <c:valAx>
-        <c:axId val="333"/>
+        <c:gapWidth val="60"/>
+        <c:axId val="111"/>
+        <c:axId val="222"/>
+      </c:barChart>
+      <c:catAx>
+        <c:axId val="111"/>
         <c:scaling>
           <c:orientation val="minMax"/>
-          <c:max val="2020"/>
-          <c:min val="2014"/>
         </c:scaling>
         <c:delete val="0"/>
         <c:axPos val="b"/>
@@ -9005,10 +9083,10 @@
           </c:tx>
           <c:overlay val="0"/>
         </c:title>
-        <c:numFmt formatCode="0" sourceLinked="0"/>
-        <c:majorTickMark val="out"/>
+        <c:numFmt formatCode="General" sourceLinked="0"/>
+        <c:majorTickMark val="none"/>
         <c:minorTickMark val="none"/>
-        <c:tickLblPos val="low"/>
+        <c:tickLblPos val="nextTo"/>
         <c:spPr>
           <a:ln w="9525">
             <a:solidFill>
@@ -9032,17 +9110,19 @@
             <a:endParaRPr lang="uz-Latn-UZ"/>
           </a:p>
         </c:txPr>
-        <c:crossAx val="444"/>
+        <c:crossAx val="222"/>
         <c:crosses val="autoZero"/>
-        <c:crossBetween val="midCat"/>
-        <c:majorUnit val="1"/>
-      </c:valAx>
+        <c:auto val="1"/>
+        <c:lblAlgn val="ctr"/>
+        <c:lblOffset val="100"/>
+        <c:noMultiLvlLbl val="0"/>
+      </c:catAx>
       <c:valAx>
-        <c:axId val="444"/>
+        <c:axId val="222"/>
         <c:scaling>
           <c:orientation val="minMax"/>
-          <c:max val="105"/>
-          <c:min val="50"/>
+          <c:max val="110"/>
+          <c:min val="0"/>
         </c:scaling>
         <c:delete val="0"/>
         <c:axPos val="l"/>
@@ -9111,10 +9191,10 @@
             <a:endParaRPr lang="uz-Latn-UZ"/>
           </a:p>
         </c:txPr>
-        <c:crossAx val="333"/>
+        <c:crossAx val="111"/>
         <c:crosses val="autoZero"/>
         <c:crossBetween val="midCat"/>
-        <c:majorUnit val="10"/>
+        <c:majorUnit val="20"/>
       </c:valAx>
       <c:spPr>
         <a:noFill/>

</xml_diff>

<commit_message>
1.3-§: 2024–2026-yillardagi islohotlar qo‘shildi, 1.3.5-rasm chiziqli (2015–2026)
Co-Authored-By: Claude Opus 5.5 <noreply@anthropic.com>
Claude-Session: https://claude.ai/code/session_01PxHTC8Q7yHdrpAeUA5KUgM
</commit_message>
<xml_diff>
--- a/paragraflar/1.3-xorijiy-tajriba.docx
+++ b/paragraflar/1.3-xorijiy-tajriba.docx
@@ -2,7 +2,7 @@
 <file path=word/document.xml><?xml version="1.0" encoding="utf-8"?>
 <w:document xmlns:w="http://schemas.openxmlformats.org/wordprocessingml/2006/main" xmlns:m="http://schemas.openxmlformats.org/officeDocument/2006/math" xmlns:r="http://schemas.openxmlformats.org/officeDocument/2006/relationships" xmlns:o="urn:schemas-microsoft-com:office:office" xmlns:v="urn:schemas-microsoft-com:vml" xmlns:w10="urn:schemas-microsoft-com:office:word" xmlns:a="http://schemas.openxmlformats.org/drawingml/2006/main" xmlns:pic="http://schemas.openxmlformats.org/drawingml/2006/picture" xmlns:wp="http://schemas.openxmlformats.org/drawingml/2006/wordprocessingDrawing">
   <w:body>
-    <w:bookmarkStart w:id="73" w:name="X0a8f05e5cd7bad167a6c1dddfdd9ff0edf10251"/>
+    <w:bookmarkStart w:id="87" w:name="X0a8f05e5cd7bad167a6c1dddfdd9ff0edf10251"/>
     <w:p>
       <w:pPr>
         <w:pStyle w:val="Heading2"/>
@@ -2753,7 +2753,7 @@
           <w:rFonts w:ascii="Times New Roman" w:hAnsi="Times New Roman" w:cs="Times New Roman" w:eastAsia="Times New Roman"/>
           <w:sz w:val="28"/>
         </w:rPr>
-        <w:t xml:space="preserve">Shu bilan birga, AQSh tajribasi tartibga solish maqsadlari o‘rtasidagi ziddiyatni ham namoyon etadi. J.M. Hendrickson qayd etishicha, kam daromadli aholini kreditlashni talab qiluvchi CRA qonuni bank kapitaliga qo‘yiladigan talablarga zid keladi: tavakkalchilik bilan kreditlash CRA reytingini yaxshilaydi, ammo CAMELS reytingini yomonlashtiradi; 1993–2007-yillarda 3,5 trln dollardan ortiq CRA kreditlari berilgan</w:t>
+        <w:t xml:space="preserve">AQSh baholash tizimi hozir ham o‘zgarishda davom etmoqda. 2023-yil bahorida Silicon Valley Bank va boshqa o‘rta banklar inqirozidan keyin nazoratning samaradorligi qayta ko‘rib chiqildi, biroq keyingi islohotlar asosan nazorat bahosini moliyaviy risklarga yanada yaqinlashtirish yo‘nalishida bormoqda. Federal rezerv tizimi 2025-yil noyabrida yirik moliya institutlari reyting tizimiga o‘zgartirish kiritib, «yaxshi boshqariladigan» bank ta’rifini yumshatdi: endi bitta komponent bo‘yicha qoniqarsiz baho bankni bu toifadan chiqarib yubormaydi</w:t>
       </w:r>
       <w:r>
         <w:rPr>
@@ -2766,7 +2766,46 @@
           <w:rFonts w:ascii="Times New Roman" w:hAnsi="Times New Roman" w:cs="Times New Roman" w:eastAsia="Times New Roman"/>
           <w:sz w:val="28"/>
         </w:rPr>
-        <w:t xml:space="preserve">. Bu xulosa davlat dasturlari bo‘yicha kreditlash ulushi yuqori bo‘lgan O‘zbekiston bank tizimi uchun ham dolzarbdir, chunki ijtimoiy maqsadlardagi kreditlash bank barqarorligi ko‘rsatkichlariga ta’sir qilmay qolmaydi.</w:t>
+        <w:t xml:space="preserve">. 2026-yil mayida esa Moliya institutlari federal ekspertiza kengashi CAMELS tizimini 1996-yildan buyon birinchi marta tubdan qayta ko‘rib chiqishni taklif qildi. Taklifga ko‘ra, yig‘ma bahoda boshqaruv komponentiga berilgan alohida ustunlik bekor qilinadi, boshqaruv bo‘yicha 3 va undan past baho esa faqat jiddiy moliyaviy risk mavjud bo‘lgandagina qo‘yiladi</w:t>
+      </w:r>
+      <w:r>
+        <w:rPr>
+          <w:rStyle w:val="FootnoteReference"/>
+        </w:rPr>
+        <w:footnoteReference w:id="33"/>
+      </w:r>
+      <w:r>
+        <w:rPr>
+          <w:rFonts w:ascii="Times New Roman" w:hAnsi="Times New Roman" w:cs="Times New Roman" w:eastAsia="Times New Roman"/>
+          <w:sz w:val="28"/>
+        </w:rPr>
+        <w:t xml:space="preserve">. Stress-testlar ham isloh qilindi: 2026-yil sentabrida qabul qilingan qoidalarga ko‘ra, ssenariylar va modellar har yili jamoatchilik muhokamasiga qo‘yiladi, stress-test asosidagi kapital buferi esa ikki yillik natijalarning o‘rtachasi bo‘yicha belgilanadi</w:t>
+      </w:r>
+      <w:r>
+        <w:rPr>
+          <w:rStyle w:val="FootnoteReference"/>
+        </w:rPr>
+        <w:footnoteReference w:id="34"/>
+      </w:r>
+      <w:r>
+        <w:rPr>
+          <w:rFonts w:ascii="Times New Roman" w:hAnsi="Times New Roman" w:cs="Times New Roman" w:eastAsia="Times New Roman"/>
+          <w:sz w:val="28"/>
+        </w:rPr>
+        <w:t xml:space="preserve">. Nihoyat, 2026-yil martida Bazel III ning yakuniy standartlarini joriy etish bo‘yicha qayta ishlangan takliflar e’lon qilindi; ular faqat eng yirik banklarga tatbiq etilishi va umumiy kapital talablarini biroz pasaytirishi kutilmoqda</w:t>
+      </w:r>
+      <w:r>
+        <w:rPr>
+          <w:rStyle w:val="FootnoteReference"/>
+        </w:rPr>
+        <w:footnoteReference w:id="35"/>
+      </w:r>
+      <w:r>
+        <w:rPr>
+          <w:rFonts w:ascii="Times New Roman" w:hAnsi="Times New Roman" w:cs="Times New Roman" w:eastAsia="Times New Roman"/>
+          <w:sz w:val="28"/>
+        </w:rPr>
+        <w:t xml:space="preserve">. Ushbu islohotlar baholash natijasini nazorat qarori bilan bog‘lash tamoyili saqlanib qolgan holda, uning mezonlari moliyaviy ko‘rsatkichlarga ko‘proq tayanadigan bo‘lib borayotganini ko‘rsatadi.</w:t>
       </w:r>
     </w:p>
     <w:p>
@@ -2781,13 +2820,41 @@
           <w:rFonts w:ascii="Times New Roman" w:hAnsi="Times New Roman" w:cs="Times New Roman" w:eastAsia="Times New Roman"/>
           <w:sz w:val="28"/>
         </w:rPr>
+        <w:t xml:space="preserve">Shu bilan birga, AQSh tajribasi tartibga solish maqsadlari o‘rtasidagi ziddiyatni ham namoyon etadi. J.M. Hendrickson qayd etishicha, kam daromadli aholini kreditlashni talab qiluvchi CRA qonuni bank kapitaliga qo‘yiladigan talablarga zid keladi: tavakkalchilik bilan kreditlash CRA reytingini yaxshilaydi, ammo CAMELS reytingini yomonlashtiradi; 1993–2007-yillarda 3,5 trln dollardan ortiq CRA kreditlari berilgan</w:t>
+      </w:r>
+      <w:r>
+        <w:rPr>
+          <w:rStyle w:val="FootnoteReference"/>
+        </w:rPr>
+        <w:footnoteReference w:id="36"/>
+      </w:r>
+      <w:r>
+        <w:rPr>
+          <w:rFonts w:ascii="Times New Roman" w:hAnsi="Times New Roman" w:cs="Times New Roman" w:eastAsia="Times New Roman"/>
+          <w:sz w:val="28"/>
+        </w:rPr>
+        <w:t xml:space="preserve">. Bu xulosa davlat dasturlari bo‘yicha kreditlash ulushi yuqori bo‘lgan O‘zbekiston bank tizimi uchun ham dolzarbdir, chunki ijtimoiy maqsadlardagi kreditlash bank barqarorligi ko‘rsatkichlariga ta’sir qilmay qolmaydi.</w:t>
+      </w:r>
+    </w:p>
+    <w:p>
+      <w:pPr>
+        <w:pStyle w:val="BodyText"/>
+        <w:spacing w:line="360" w:lineRule="auto" w:before="0" w:after="0"/>
+        <w:ind w:firstLine="709"/>
+        <w:jc w:val="both"/>
+      </w:pPr>
+      <w:r>
+        <w:rPr>
+          <w:rFonts w:ascii="Times New Roman" w:hAnsi="Times New Roman" w:cs="Times New Roman" w:eastAsia="Times New Roman"/>
+          <w:sz w:val="28"/>
+        </w:rPr>
         <w:t xml:space="preserve">AQShdan farqli ravishda, G‘arbiy Yevropa mamlakatlari nazoratni risklarga asoslangan holda tashkil etishga ko‘proq e’tibor qaratgan. Bu yo‘nalishda Buyuk Britaniya tajribasi alohida o‘rin tutadi. Angliya banki 1997-yildan BAITE tizimini qo‘llab kelmoqda. U uch blokdan, ya’ni risklarni baholash, nazorat vositalari va samaradorlikni baholashdan iborat bo‘lib, to‘qqiz yo‘nalish bo‘yicha risklarni tahlil qiladi</w:t>
       </w:r>
       <w:r>
         <w:rPr>
           <w:rStyle w:val="FootnoteReference"/>
         </w:rPr>
-        <w:footnoteReference w:id="33"/>
+        <w:footnoteReference w:id="37"/>
       </w:r>
       <w:r>
         <w:rPr>
@@ -2800,7 +2867,7 @@
         <w:rPr>
           <w:rStyle w:val="FootnoteReference"/>
         </w:rPr>
-        <w:footnoteReference w:id="34"/>
+        <w:footnoteReference w:id="38"/>
       </w:r>
       <w:r>
         <w:rPr>
@@ -3481,7 +3548,7 @@
         <w:rPr>
           <w:rStyle w:val="FootnoteReference"/>
         </w:rPr>
-        <w:footnoteReference w:id="35"/>
+        <w:footnoteReference w:id="39"/>
       </w:r>
     </w:p>
     <w:p>
@@ -3517,7 +3584,7 @@
         <w:rPr>
           <w:rStyle w:val="FootnoteReference"/>
         </w:rPr>
-        <w:footnoteReference w:id="36"/>
+        <w:footnoteReference w:id="40"/>
       </w:r>
       <w:r>
         <w:rPr>
@@ -3545,7 +3612,7 @@
         <w:rPr>
           <w:rStyle w:val="FootnoteReference"/>
         </w:rPr>
-        <w:footnoteReference w:id="37"/>
+        <w:footnoteReference w:id="41"/>
       </w:r>
       <w:r>
         <w:rPr>
@@ -3558,7 +3625,7 @@
         <w:rPr>
           <w:rStyle w:val="FootnoteReference"/>
         </w:rPr>
-        <w:footnoteReference w:id="38"/>
+        <w:footnoteReference w:id="42"/>
       </w:r>
       <w:r>
         <w:rPr>
@@ -3571,7 +3638,7 @@
         <w:rPr>
           <w:rStyle w:val="FootnoteReference"/>
         </w:rPr>
-        <w:footnoteReference w:id="39"/>
+        <w:footnoteReference w:id="43"/>
       </w:r>
       <w:r>
         <w:rPr>
@@ -3599,7 +3666,7 @@
         <w:rPr>
           <w:rStyle w:val="FootnoteReference"/>
         </w:rPr>
-        <w:footnoteReference w:id="40"/>
+        <w:footnoteReference w:id="44"/>
       </w:r>
       <w:r>
         <w:rPr>
@@ -3627,7 +3694,7 @@
         <w:rPr>
           <w:rStyle w:val="FootnoteReference"/>
         </w:rPr>
-        <w:footnoteReference w:id="41"/>
+        <w:footnoteReference w:id="45"/>
       </w:r>
       <w:r>
         <w:rPr>
@@ -3655,7 +3722,7 @@
         <w:rPr>
           <w:rStyle w:val="FootnoteReference"/>
         </w:rPr>
-        <w:footnoteReference w:id="42"/>
+        <w:footnoteReference w:id="46"/>
       </w:r>
       <w:r>
         <w:rPr>
@@ -3668,7 +3735,7 @@
         <w:rPr>
           <w:rStyle w:val="FootnoteReference"/>
         </w:rPr>
-        <w:footnoteReference w:id="43"/>
+        <w:footnoteReference w:id="47"/>
       </w:r>
       <w:r>
         <w:rPr>
@@ -3696,7 +3763,7 @@
         <w:rPr>
           <w:rStyle w:val="FootnoteReference"/>
         </w:rPr>
-        <w:footnoteReference w:id="44"/>
+        <w:footnoteReference w:id="48"/>
       </w:r>
       <w:r>
         <w:rPr>
@@ -3709,7 +3776,7 @@
         <w:rPr>
           <w:rStyle w:val="FootnoteReference"/>
         </w:rPr>
-        <w:footnoteReference w:id="45"/>
+        <w:footnoteReference w:id="49"/>
       </w:r>
       <w:r>
         <w:rPr>
@@ -3717,6 +3784,60 @@
           <w:sz w:val="28"/>
         </w:rPr>
         <w:t xml:space="preserve">.</w:t>
+      </w:r>
+    </w:p>
+    <w:p>
+      <w:pPr>
+        <w:pStyle w:val="BodyText"/>
+        <w:spacing w:line="360" w:lineRule="auto" w:before="0" w:after="0"/>
+        <w:ind w:firstLine="709"/>
+        <w:jc w:val="both"/>
+      </w:pPr>
+      <w:r>
+        <w:rPr>
+          <w:rFonts w:ascii="Times New Roman" w:hAnsi="Times New Roman" w:cs="Times New Roman" w:eastAsia="Times New Roman"/>
+          <w:sz w:val="28"/>
+        </w:rPr>
+        <w:t xml:space="preserve">Yevropa Ittifoqida Bazel III ning yakuniy standartlarini joriy etish ham so‘nggi yillarda nihoyasiga yetmoqda. 2025-yil 1-yanvardan kapital talablari bo‘yicha yangi reglament (CRR3) amalga kirdi; unda ichki modellar asosida hisoblangan kapital standart yondashuvdagi darajaning 72,5 foizidan past bo‘lmasligini talab qiluvchi «quyi chegara» bosqichma-bosqich joriy etiladi, bozor riski bo‘yicha yangi talablar esa 2027-yilgacha kechiktirildi</w:t>
+      </w:r>
+      <w:r>
+        <w:rPr>
+          <w:rStyle w:val="FootnoteReference"/>
+        </w:rPr>
+        <w:footnoteReference w:id="50"/>
+      </w:r>
+      <w:r>
+        <w:rPr>
+          <w:rFonts w:ascii="Times New Roman" w:hAnsi="Times New Roman" w:cs="Times New Roman" w:eastAsia="Times New Roman"/>
+          <w:sz w:val="28"/>
+        </w:rPr>
+        <w:t xml:space="preserve">. Buyuk Britaniyada bu standartlar 2027-yil 1-yanvardan kuchga kiradi</w:t>
+      </w:r>
+      <w:r>
+        <w:rPr>
+          <w:rStyle w:val="FootnoteReference"/>
+        </w:rPr>
+        <w:footnoteReference w:id="51"/>
+      </w:r>
+      <w:r>
+        <w:rPr>
+          <w:rFonts w:ascii="Times New Roman" w:hAnsi="Times New Roman" w:cs="Times New Roman" w:eastAsia="Times New Roman"/>
+          <w:sz w:val="28"/>
+        </w:rPr>
+        <w:t xml:space="preserve">. Nazorat stress-testlari ham muntazam davom etmoqda: Yevropa bank boshqarmasining 2025-yilgi stress-testi 17 mamlakatdagi 64 ta bankni, ya’ni Ittifoq bank sektori aktivlarining 75 foizini qamrab oldi. Salbiy ssenariyda banklarning asosiy kapitali 370 bazis punktga kamayib, uch yil oxirida 12 foizni tashkil etishi aniqlandi</w:t>
+      </w:r>
+      <w:r>
+        <w:rPr>
+          <w:rStyle w:val="FootnoteReference"/>
+        </w:rPr>
+        <w:footnoteReference w:id="52"/>
+      </w:r>
+      <w:r>
+        <w:rPr>
+          <w:rFonts w:ascii="Times New Roman" w:hAnsi="Times New Roman" w:cs="Times New Roman" w:eastAsia="Times New Roman"/>
+          <w:sz w:val="28"/>
+        </w:rPr>
+        <w:t xml:space="preserve">. Bu natijalar ham har bir bank kesimida ochiq e’lon qilinadi.</w:t>
       </w:r>
     </w:p>
     <w:p>
@@ -3772,7 +3893,7 @@
         <w:rPr>
           <w:rStyle w:val="FootnoteReference"/>
         </w:rPr>
-        <w:footnoteReference w:id="46"/>
+        <w:footnoteReference w:id="53"/>
       </w:r>
     </w:p>
     <w:tbl>
@@ -4219,6 +4340,124 @@
           </w:p>
         </w:tc>
       </w:tr>
+      <w:tr>
+        <w:trPr>
+          <w:cantSplit/>
+        </w:trPr>
+        <w:tc>
+          <w:tcPr/>
+          <w:p>
+            <w:pPr>
+              <w:pStyle w:val="Compact"/>
+              <w:spacing w:line="240" w:lineRule="auto"/>
+              <w:ind w:firstLine="0"/>
+              <w:jc w:val="left"/>
+            </w:pPr>
+            <w:r>
+              <w:rPr>
+                <w:rFonts w:ascii="Times New Roman" w:hAnsi="Times New Roman" w:cs="Times New Roman" w:eastAsia="Times New Roman"/>
+                <w:sz w:val="22"/>
+              </w:rPr>
+              <w:t xml:space="preserve">2025</w:t>
+            </w:r>
+          </w:p>
+        </w:tc>
+        <w:tc>
+          <w:tcPr/>
+          <w:p>
+            <w:pPr>
+              <w:pStyle w:val="Compact"/>
+              <w:spacing w:line="240" w:lineRule="auto"/>
+              <w:ind w:firstLine="0"/>
+              <w:jc w:val="left"/>
+            </w:pPr>
+            <w:r>
+              <w:rPr>
+                <w:rFonts w:ascii="Times New Roman" w:hAnsi="Times New Roman" w:cs="Times New Roman" w:eastAsia="Times New Roman"/>
+                <w:sz w:val="22"/>
+              </w:rPr>
+              <w:t xml:space="preserve">Milliy qisqa muddatli likvidlik normativi</w:t>
+            </w:r>
+          </w:p>
+        </w:tc>
+        <w:tc>
+          <w:tcPr/>
+          <w:p>
+            <w:pPr>
+              <w:pStyle w:val="Compact"/>
+              <w:spacing w:line="240" w:lineRule="auto"/>
+              <w:ind w:firstLine="0"/>
+              <w:jc w:val="left"/>
+            </w:pPr>
+            <w:r>
+              <w:rPr>
+                <w:rFonts w:ascii="Times New Roman" w:hAnsi="Times New Roman" w:cs="Times New Roman" w:eastAsia="Times New Roman"/>
+                <w:sz w:val="22"/>
+              </w:rPr>
+              <w:t xml:space="preserve">Bazel LCR o‘rniga tizimli banklar uchun milliy normativ; real stress darajasi va kengroq likvid aktivlar</w:t>
+            </w:r>
+          </w:p>
+        </w:tc>
+      </w:tr>
+      <w:tr>
+        <w:trPr>
+          <w:cantSplit/>
+        </w:trPr>
+        <w:tc>
+          <w:tcPr/>
+          <w:p>
+            <w:pPr>
+              <w:pStyle w:val="Compact"/>
+              <w:spacing w:line="240" w:lineRule="auto"/>
+              <w:ind w:firstLine="0"/>
+              <w:jc w:val="left"/>
+            </w:pPr>
+            <w:r>
+              <w:rPr>
+                <w:rFonts w:ascii="Times New Roman" w:hAnsi="Times New Roman" w:cs="Times New Roman" w:eastAsia="Times New Roman"/>
+                <w:sz w:val="22"/>
+              </w:rPr>
+              <w:t xml:space="preserve">2026</w:t>
+            </w:r>
+          </w:p>
+        </w:tc>
+        <w:tc>
+          <w:tcPr/>
+          <w:p>
+            <w:pPr>
+              <w:pStyle w:val="Compact"/>
+              <w:spacing w:line="240" w:lineRule="auto"/>
+              <w:ind w:firstLine="0"/>
+              <w:jc w:val="left"/>
+            </w:pPr>
+            <w:r>
+              <w:rPr>
+                <w:rFonts w:ascii="Times New Roman" w:hAnsi="Times New Roman" w:cs="Times New Roman" w:eastAsia="Times New Roman"/>
+                <w:sz w:val="22"/>
+              </w:rPr>
+              <w:t xml:space="preserve">7302-U ko‘rsatma</w:t>
+            </w:r>
+          </w:p>
+        </w:tc>
+        <w:tc>
+          <w:tcPr/>
+          <w:p>
+            <w:pPr>
+              <w:pStyle w:val="Compact"/>
+              <w:spacing w:line="240" w:lineRule="auto"/>
+              <w:ind w:firstLine="0"/>
+              <w:jc w:val="left"/>
+            </w:pPr>
+            <w:r>
+              <w:rPr>
+                <w:rFonts w:ascii="Times New Roman" w:hAnsi="Times New Roman" w:cs="Times New Roman" w:eastAsia="Times New Roman"/>
+                <w:sz w:val="22"/>
+              </w:rPr>
+              <w:t xml:space="preserve">4336-U ko‘rsatmaga o‘zgartirishlar, jumladan, ochiq valyuta pozitsiyasi limitlarini buzish bahosi</w:t>
+            </w:r>
+          </w:p>
+        </w:tc>
+      </w:tr>
     </w:tbl>
     <w:p>
       <w:pPr>
@@ -4253,7 +4492,7 @@
         <w:rPr>
           <w:rStyle w:val="FootnoteReference"/>
         </w:rPr>
-        <w:footnoteReference w:id="47"/>
+        <w:footnoteReference w:id="54"/>
       </w:r>
       <w:r>
         <w:rPr>
@@ -4266,7 +4505,7 @@
         <w:rPr>
           <w:rStyle w:val="FootnoteReference"/>
         </w:rPr>
-        <w:footnoteReference w:id="48"/>
+        <w:footnoteReference w:id="55"/>
       </w:r>
       <w:r>
         <w:rPr>
@@ -4279,7 +4518,7 @@
         <w:rPr>
           <w:rStyle w:val="FootnoteReference"/>
         </w:rPr>
-        <w:footnoteReference w:id="49"/>
+        <w:footnoteReference w:id="56"/>
       </w:r>
       <w:r>
         <w:rPr>
@@ -4307,14 +4546,14 @@
         <w:rPr>
           <w:rStyle w:val="FootnoteReference"/>
         </w:rPr>
-        <w:footnoteReference w:id="50"/>
-      </w:r>
-      <w:r>
-        <w:rPr>
-          <w:rFonts w:ascii="Times New Roman" w:hAnsi="Times New Roman" w:cs="Times New Roman" w:eastAsia="Times New Roman"/>
-          <w:sz w:val="28"/>
-        </w:rPr>
-        <w:t xml:space="preserve">. Ushbu jadvalni Bazel qo‘mitasining standart jadvali va O‘zbekiston jadvali bilan solishtirish qiziqarli manzarani beradi (1.3.5-rasm).</w:t>
+        <w:footnoteReference w:id="57"/>
+      </w:r>
+      <w:r>
+        <w:rPr>
+          <w:rFonts w:ascii="Times New Roman" w:hAnsi="Times New Roman" w:cs="Times New Roman" w:eastAsia="Times New Roman"/>
+          <w:sz w:val="28"/>
+        </w:rPr>
+        <w:t xml:space="preserve">. Bu jarayon 2019-yilda yakunlanmadi, balki keyingi yillarda ham davom etdi. Shu sababli islohotning boshlanishini ham, davomini ham Bazel qo‘mitasining standart jadvali va O‘zbekiston tajribasi bilan solishtirish maqsadga muvofiq (1.3.5-rasm).</w:t>
       </w:r>
     </w:p>
     <w:p>
@@ -4331,7 +4570,7 @@
         </w:rPr>
         <w:drawing>
           <wp:inline distT="0" distB="0" distL="0" distR="0">
-            <wp:extent cx="5580000" cy="2880000"/>
+            <wp:extent cx="5760000" cy="3420000"/>
             <wp:effectExtent l="0" t="0" r="0" b="0"/>
             <wp:docPr id="1005" name="1.3.5-rasm"/>
             <wp:cNvGraphicFramePr/>
@@ -4357,13 +4596,13 @@
           <w:b/>
           <w:sz w:val="28"/>
         </w:rPr>
-        <w:t xml:space="preserve">1.3.5-rasm. Likvidlikni qoplash koeffitsiyentini joriy etish jadvallari, %</w:t>
-      </w:r>
-      <w:r>
-        <w:rPr>
-          <w:rStyle w:val="FootnoteReference"/>
-        </w:rPr>
-        <w:footnoteReference w:id="51"/>
+        <w:t xml:space="preserve">1.3.5-rasm. Likvidlikni qoplash koeffitsiyentiga qo‘yiladigan talablar: islohotning boshlanishi va davomi, %</w:t>
+      </w:r>
+      <w:r>
+        <w:rPr>
+          <w:rStyle w:val="FootnoteReference"/>
+        </w:rPr>
+        <w:footnoteReference w:id="58"/>
       </w:r>
     </w:p>
     <w:p>
@@ -4384,7 +4623,7 @@
         <w:rPr>
           <w:rStyle w:val="FootnoteReference"/>
         </w:rPr>
-        <w:footnoteReference w:id="52"/>
+        <w:footnoteReference w:id="59"/>
       </w:r>
       <w:r>
         <w:rPr>
@@ -4406,20 +4645,59 @@
           <w:rFonts w:ascii="Times New Roman" w:hAnsi="Times New Roman" w:cs="Times New Roman" w:eastAsia="Times New Roman"/>
           <w:sz w:val="28"/>
         </w:rPr>
-        <w:t xml:space="preserve">Shu bilan birga, Rossiya bankining 3883-U ko‘rsatmasi bilan ichki kapital yetarliligini baholash jarayoni joriy etildi. Mualliflar uni avval aktivlari 500 mlrd rubldan oshgan banklarda, keyin esa boshqa banklarda bosqichma-bosqich joriy etishni taklif qilgan</w:t>
-      </w:r>
-      <w:r>
-        <w:rPr>
-          <w:rStyle w:val="FootnoteReference"/>
-        </w:rPr>
-        <w:footnoteReference w:id="53"/>
-      </w:r>
-      <w:r>
-        <w:rPr>
-          <w:rFonts w:ascii="Times New Roman" w:hAnsi="Times New Roman" w:cs="Times New Roman" w:eastAsia="Times New Roman"/>
-          <w:sz w:val="28"/>
-        </w:rPr>
-        <w:t xml:space="preserve">. Bunday tabaqalashtirilgan yondashuv kichik banklarga ortiqcha yuk tushishining oldini oladi va O‘zbekistonda ham qo‘llanishi mumkin.</w:t>
+        <w:t xml:space="preserve">Islohotning keyingi bosqichi bu xulosani yana bir bor tasdiqladi. 2022-yil boshida sanksiyalar sharoitida Rossiya banki tizimli ahamiyatli banklarga ushbu normativni vaqtincha bajarmaslikka ruxsat berdi. Yengillikdan chiqish 2024-yil 1-martdan boshlandi: normativning 100 foizlik darajasi tiklangan bo‘lsa-da, banklar uning bir qismini Markaziy bankning qaytarib olinmaydigan kredit liniyalari hisobidan bajarishi mumkin edi. Banklarning o‘z mablag‘lari hisobidan ta’minlanishi lozim bo‘lgan qism esa 2024-yil martida 40 foiz, iyulida 50 foiz, 2025-yil iyulida 60 foiz, 2026-yil yanvarida 80 foiz qilib belgilandi</w:t>
+      </w:r>
+      <w:r>
+        <w:rPr>
+          <w:rStyle w:val="FootnoteReference"/>
+        </w:rPr>
+        <w:footnoteReference w:id="60"/>
+      </w:r>
+      <w:r>
+        <w:rPr>
+          <w:rFonts w:ascii="Times New Roman" w:hAnsi="Times New Roman" w:cs="Times New Roman" w:eastAsia="Times New Roman"/>
+          <w:sz w:val="28"/>
+        </w:rPr>
+        <w:t xml:space="preserve">. Bundan tashqari, 2025-yil oktabr oyining oxiridan boshlab tizimli banklar uchun Bazel normativi o‘rniga milliy qisqa muddatli likvidlik normativi joriy etildi. U o‘rtacha tizimli yoki jiddiy individual inqirozga mos keladigan, ya’ni real stress darajasidan kelib chiqib hisoblanadi va mahalliy bozorda pul jalb qilish mumkin bo‘lgan aktivlarning kengroq doirasini hisobga oladi; uning minimal darajasi 2025-yilda 80 foiz, 2026-yil 1-yanvardan 100 foiz etib belgilandi</w:t>
+      </w:r>
+      <w:r>
+        <w:rPr>
+          <w:rStyle w:val="FootnoteReference"/>
+        </w:rPr>
+        <w:footnoteReference w:id="61"/>
+      </w:r>
+      <w:r>
+        <w:rPr>
+          <w:rFonts w:ascii="Times New Roman" w:hAnsi="Times New Roman" w:cs="Times New Roman" w:eastAsia="Times New Roman"/>
+          <w:sz w:val="28"/>
+        </w:rPr>
+        <w:t xml:space="preserve">. Shunday qilib, Rossiya o‘n yillik tajribadan so‘ng xalqaro koeffitsiyentdan voz kechib, uning mantig‘ini saqlagan holda milliy bozorga moslashtirilgan normativga o‘tdi. O‘zbekistonda esa 2018-yildan buyon 100 foizlik talab o‘zgarishsiz amal qilmoqda, XVJ va Jahon bankining moliya sektorini baholash dasturi natijalari asosida qabul qilingan «yo‘l xaritasi»ga ko‘ra esa LCR va NSFR elementlarini Bazel III ga to‘liq moslashtirish va 2026-yil 1-yanvardan monitoring qilish ko‘zda tutilgan</w:t>
+      </w:r>
+      <w:r>
+        <w:rPr>
+          <w:rStyle w:val="FootnoteReference"/>
+        </w:rPr>
+        <w:footnoteReference w:id="62"/>
+      </w:r>
+      <w:r>
+        <w:rPr>
+          <w:rFonts w:ascii="Times New Roman" w:hAnsi="Times New Roman" w:cs="Times New Roman" w:eastAsia="Times New Roman"/>
+          <w:sz w:val="28"/>
+        </w:rPr>
+        <w:t xml:space="preserve">. Bazel qo‘mitasi ham 2023-yilgi AQSh bank inqirozidan keyin raqamli kanallar orqali omonatlarning tez chiqib ketishi likvidlik koeffitsiyentining farazlarida to‘liq aks etmaganini qayd etib, bu standartni qayta ko‘rib chiqish masalasini kun tartibiga qo‘ydi</w:t>
+      </w:r>
+      <w:r>
+        <w:rPr>
+          <w:rStyle w:val="FootnoteReference"/>
+        </w:rPr>
+        <w:footnoteReference w:id="63"/>
+      </w:r>
+      <w:r>
+        <w:rPr>
+          <w:rFonts w:ascii="Times New Roman" w:hAnsi="Times New Roman" w:cs="Times New Roman" w:eastAsia="Times New Roman"/>
+          <w:sz w:val="28"/>
+        </w:rPr>
+        <w:t xml:space="preserve">.</w:t>
       </w:r>
     </w:p>
     <w:p>
@@ -4434,20 +4712,61 @@
           <w:rFonts w:ascii="Times New Roman" w:hAnsi="Times New Roman" w:cs="Times New Roman" w:eastAsia="Times New Roman"/>
           <w:sz w:val="28"/>
         </w:rPr>
+        <w:t xml:space="preserve">Shu bilan birga, Rossiya bankining 3883-U ko‘rsatmasi bilan ichki kapital yetarliligini baholash jarayoni joriy etildi. Mualliflar uni avval aktivlari 500 mlrd rubldan oshgan banklarda, keyin esa boshqa banklarda bosqichma-bosqich joriy etishni taklif qilgan</w:t>
+      </w:r>
+      <w:r>
+        <w:rPr>
+          <w:rStyle w:val="FootnoteReference"/>
+        </w:rPr>
+        <w:footnoteReference w:id="64"/>
+      </w:r>
+      <w:r>
+        <w:rPr>
+          <w:rFonts w:ascii="Times New Roman" w:hAnsi="Times New Roman" w:cs="Times New Roman" w:eastAsia="Times New Roman"/>
+          <w:sz w:val="28"/>
+        </w:rPr>
+        <w:t xml:space="preserve">. Bunday tabaqalashtirilgan yondashuv kichik banklarga ortiqcha yuk tushishining oldini oladi va O‘zbekistonda ham qo‘llanishi mumkin.</w:t>
+      </w:r>
+    </w:p>
+    <w:p>
+      <w:pPr>
+        <w:pStyle w:val="BodyText"/>
+        <w:spacing w:line="360" w:lineRule="auto" w:before="0" w:after="0"/>
+        <w:ind w:firstLine="709"/>
+        <w:jc w:val="both"/>
+      </w:pPr>
+      <w:r>
+        <w:rPr>
+          <w:rFonts w:ascii="Times New Roman" w:hAnsi="Times New Roman" w:cs="Times New Roman" w:eastAsia="Times New Roman"/>
+          <w:sz w:val="28"/>
+        </w:rPr>
         <w:t xml:space="preserve">Mikroprudensial baholash bilan bir qatorda Rossiya bankida makroprudensial monitoring tizimi ham shakllangan. Markaziy bank haftalik 30 dan ortiq ko‘rsatkich asosida trigger-monitoring olib boradi va stress-testlarni muayyan arxitektura bo‘yicha o‘tkazadi. Unga ko‘ra avval makroiqtisodiy model yordamida YaIM, valyuta kursi, inflyatsiya, daromadlar va investitsiyalar prognozi tuziladi, so‘ngra shu prognoz asosida bank ko‘rsatkichlari, shu jumladan muammoli kreditlar ulushi hisoblanadi, keyin balansning imitatsion modeli orqali kapital va likvidlik tanqisligi baholanadi</w:t>
       </w:r>
       <w:r>
         <w:rPr>
           <w:rStyle w:val="FootnoteReference"/>
         </w:rPr>
-        <w:footnoteReference w:id="54"/>
-      </w:r>
-      <w:r>
-        <w:rPr>
-          <w:rFonts w:ascii="Times New Roman" w:hAnsi="Times New Roman" w:cs="Times New Roman" w:eastAsia="Times New Roman"/>
-          <w:sz w:val="28"/>
-        </w:rPr>
-        <w:t xml:space="preserve">. Bu arxitektura AQSh Federal rezerv tizimi nazorat stress-testlarining mantig‘iga ancha yaqin (1.3.6-rasm).</w:t>
+        <w:footnoteReference w:id="65"/>
+      </w:r>
+      <w:r>
+        <w:rPr>
+          <w:rFonts w:ascii="Times New Roman" w:hAnsi="Times New Roman" w:cs="Times New Roman" w:eastAsia="Times New Roman"/>
+          <w:sz w:val="28"/>
+        </w:rPr>
+        <w:t xml:space="preserve">. Bu arxitektura AQSh Federal rezerv tizimi nazorat stress-testlarining mantig‘iga ancha yaqin (1.3.6-rasm). So‘nggi yillarda makroprudensial vositalar ham faol qo‘llanmoqda: Rossiya banki 2024-yil noyabrida birinchi marta kontrsiklik buferning musbat darajasini belgilab, uni 2025-yil 1-fevraldan 0,25 foiz, 1-iyuldan 0,5 foiz qilib o‘rnatdi</w:t>
+      </w:r>
+      <w:r>
+        <w:rPr>
+          <w:rStyle w:val="FootnoteReference"/>
+        </w:rPr>
+        <w:footnoteReference w:id="66"/>
+      </w:r>
+      <w:r>
+        <w:rPr>
+          <w:rFonts w:ascii="Times New Roman" w:hAnsi="Times New Roman" w:cs="Times New Roman" w:eastAsia="Times New Roman"/>
+          <w:sz w:val="28"/>
+        </w:rPr>
+        <w:t xml:space="preserve">.</w:t>
       </w:r>
     </w:p>
     <w:p>
@@ -5342,7 +5661,7 @@
         <w:rPr>
           <w:rStyle w:val="FootnoteReference"/>
         </w:rPr>
-        <w:footnoteReference w:id="55"/>
+        <w:footnoteReference w:id="67"/>
       </w:r>
     </w:p>
     <w:p>
@@ -5363,7 +5682,7 @@
         <w:rPr>
           <w:rStyle w:val="FootnoteReference"/>
         </w:rPr>
-        <w:footnoteReference w:id="56"/>
+        <w:footnoteReference w:id="68"/>
       </w:r>
       <w:r>
         <w:rPr>
@@ -5376,7 +5695,7 @@
         <w:rPr>
           <w:rStyle w:val="FootnoteReference"/>
         </w:rPr>
-        <w:footnoteReference w:id="57"/>
+        <w:footnoteReference w:id="69"/>
       </w:r>
       <w:r>
         <w:rPr>
@@ -5404,7 +5723,7 @@
         <w:rPr>
           <w:rStyle w:val="FootnoteReference"/>
         </w:rPr>
-        <w:footnoteReference w:id="58"/>
+        <w:footnoteReference w:id="70"/>
       </w:r>
       <w:r>
         <w:rPr>
@@ -5417,7 +5736,20 @@
         <w:rPr>
           <w:rStyle w:val="FootnoteReference"/>
         </w:rPr>
-        <w:footnoteReference w:id="59"/>
+        <w:footnoteReference w:id="71"/>
+      </w:r>
+      <w:r>
+        <w:rPr>
+          <w:rFonts w:ascii="Times New Roman" w:hAnsi="Times New Roman" w:cs="Times New Roman" w:eastAsia="Times New Roman"/>
+          <w:sz w:val="28"/>
+        </w:rPr>
+        <w:t xml:space="preserve">. Keyinchalik, 2015-yilda kreditlarning depozitlarga nisbati bo‘yicha qat’iy cheklov qonundan chiqarilib, monitoring ko‘rsatkichiga aylantirildi</w:t>
+      </w:r>
+      <w:r>
+        <w:rPr>
+          <w:rStyle w:val="FootnoteReference"/>
+        </w:rPr>
+        <w:footnoteReference w:id="72"/>
       </w:r>
       <w:r>
         <w:rPr>
@@ -5430,14 +5762,27 @@
         <w:rPr>
           <w:rStyle w:val="FootnoteReference"/>
         </w:rPr>
-        <w:footnoteReference w:id="60"/>
-      </w:r>
-      <w:r>
-        <w:rPr>
-          <w:rFonts w:ascii="Times New Roman" w:hAnsi="Times New Roman" w:cs="Times New Roman" w:eastAsia="Times New Roman"/>
-          <w:sz w:val="28"/>
-        </w:rPr>
-        <w:t xml:space="preserve">.</w:t>
+        <w:footnoteReference w:id="73"/>
+      </w:r>
+      <w:r>
+        <w:rPr>
+          <w:rFonts w:ascii="Times New Roman" w:hAnsi="Times New Roman" w:cs="Times New Roman" w:eastAsia="Times New Roman"/>
+          <w:sz w:val="28"/>
+        </w:rPr>
+        <w:t xml:space="preserve">. 2024-yil 1-yanvardan esa tijorat banklari kapitalini boshqarish bo‘yicha yangi qoidalar kuchga kirdi. Unga ko‘ra banklar aktivlari hajmi va xorijiy faoliyati ko‘lamiga qarab uch guruhga ajratiladi: yirik va xalqaro faoliyat yurituvchi banklarga Bazel III ning to‘liq talablari qo‘llanadi, kichikroq banklarga soddalashtirilgan, eng kichik banklarga esa yanada soddalashtirilgan talablar qo‘yiladi</w:t>
+      </w:r>
+      <w:r>
+        <w:rPr>
+          <w:rStyle w:val="FootnoteReference"/>
+        </w:rPr>
+        <w:footnoteReference w:id="74"/>
+      </w:r>
+      <w:r>
+        <w:rPr>
+          <w:rFonts w:ascii="Times New Roman" w:hAnsi="Times New Roman" w:cs="Times New Roman" w:eastAsia="Times New Roman"/>
+          <w:sz w:val="28"/>
+        </w:rPr>
+        <w:t xml:space="preserve">. Bu proporsional yondashuv O‘zbekiston uchun ham e’tiborga loyiq, chunki mamlakatdagi banklar hajmi va faoliyat murakkabligi jihatidan keskin farq qiladi.</w:t>
       </w:r>
     </w:p>
     <w:p>
@@ -5458,7 +5803,7 @@
         <w:rPr>
           <w:rStyle w:val="FootnoteReference"/>
         </w:rPr>
-        <w:footnoteReference w:id="61"/>
+        <w:footnoteReference w:id="75"/>
       </w:r>
       <w:r>
         <w:rPr>
@@ -5471,7 +5816,7 @@
         <w:rPr>
           <w:rStyle w:val="FootnoteReference"/>
         </w:rPr>
-        <w:footnoteReference w:id="62"/>
+        <w:footnoteReference w:id="76"/>
       </w:r>
       <w:r>
         <w:rPr>
@@ -5499,7 +5844,7 @@
         <w:rPr>
           <w:rStyle w:val="FootnoteReference"/>
         </w:rPr>
-        <w:footnoteReference w:id="63"/>
+        <w:footnoteReference w:id="77"/>
       </w:r>
       <w:r>
         <w:rPr>
@@ -5512,7 +5857,7 @@
         <w:rPr>
           <w:rStyle w:val="FootnoteReference"/>
         </w:rPr>
-        <w:footnoteReference w:id="64"/>
+        <w:footnoteReference w:id="78"/>
       </w:r>
       <w:r>
         <w:rPr>
@@ -5525,7 +5870,7 @@
         <w:rPr>
           <w:rStyle w:val="FootnoteReference"/>
         </w:rPr>
-        <w:footnoteReference w:id="65"/>
+        <w:footnoteReference w:id="79"/>
       </w:r>
       <w:r>
         <w:rPr>
@@ -5581,7 +5926,7 @@
         <w:rPr>
           <w:rStyle w:val="FootnoteReference"/>
         </w:rPr>
-        <w:footnoteReference w:id="66"/>
+        <w:footnoteReference w:id="80"/>
       </w:r>
     </w:p>
     <w:p>
@@ -5602,7 +5947,7 @@
         <w:rPr>
           <w:rStyle w:val="FootnoteReference"/>
         </w:rPr>
-        <w:footnoteReference w:id="67"/>
+        <w:footnoteReference w:id="81"/>
       </w:r>
       <w:r>
         <w:rPr>
@@ -5615,7 +5960,7 @@
         <w:rPr>
           <w:rStyle w:val="FootnoteReference"/>
         </w:rPr>
-        <w:footnoteReference w:id="68"/>
+        <w:footnoteReference w:id="82"/>
       </w:r>
       <w:r>
         <w:rPr>
@@ -5643,7 +5988,7 @@
         <w:rPr>
           <w:rStyle w:val="FootnoteReference"/>
         </w:rPr>
-        <w:footnoteReference w:id="69"/>
+        <w:footnoteReference w:id="83"/>
       </w:r>
       <w:r>
         <w:rPr>
@@ -5656,7 +6001,7 @@
         <w:rPr>
           <w:rStyle w:val="FootnoteReference"/>
         </w:rPr>
-        <w:footnoteReference w:id="70"/>
+        <w:footnoteReference w:id="84"/>
       </w:r>
       <w:r>
         <w:rPr>
@@ -5669,7 +6014,7 @@
         <w:rPr>
           <w:rStyle w:val="FootnoteReference"/>
         </w:rPr>
-        <w:footnoteReference w:id="71"/>
+        <w:footnoteReference w:id="85"/>
       </w:r>
       <w:r>
         <w:rPr>
@@ -5732,7 +6077,7 @@
         <w:rPr>
           <w:rStyle w:val="FootnoteReference"/>
         </w:rPr>
-        <w:footnoteReference w:id="72"/>
+        <w:footnoteReference w:id="86"/>
       </w:r>
     </w:p>
     <w:tbl>
@@ -6432,7 +6777,7 @@
         <w:t xml:space="preserve">Xorijiy mamlakatlar tajribasini tadqiq etgan holda xulosa qilish mumkinki, banklar moliyaviy barqarorligini baholashda reyting tizimlari, koeffitsiyentlar va guruhlab tahlil qilish tizimlari, risklarni kompleks baholash tizimlari hamda statistik modellardan iborat to‘rt turdagi yondashuv qo‘llanadi va rivojlangan mamlakatlarda ular bir-birini to‘ldirgan holda birgalikda ishlatiladi. AQSh tajribasi kapital ko‘rsatkichini pog‘onali shkala bilan baholab, uni majburiy nazorat choralari bilan bog‘lash, statistik modellar orqali bashorat aniqligini oshirish va stress-test natijalarini oshkor qilish samarali ekanini ko‘rsatdi. G‘arbiy Yevropa mamlakatlari nazorat intensivligini risk darajasiga bog‘lash va qiyosiy baholash afzalliklarini, Yevropa Ittifoqi esa mikro va makroprudensial nazoratni integratsiyalash hamda ochiq ma’lumotlar bazasini shakllantirish ahamiyatini namoyon etdi. Rossiya tajribasi ochiq vaznli ballik tizimning afzalliklari bilan birga uning dinamika va prognozni hisobga olmaslik kabi kamchiliklarini, Bazel III ni joriy etishda esa milliy bozorning tayyorligini inobatga olish zarurligini ochib berdi. Xitoy tajribasi davlat ulushi yuqori bo‘lgan tizimlarda rasmiy ko‘rsatkichlar ishonchliligi muammosini yaqqol ko‘rsatdi. Bu o‘z navbatida, O‘zbekistonda baholash natijalarini nazorat choralari bilan bog‘lash, baholash metodikasining shaffofligi va bashorat kuchini ta’minlash hamda aktivlar sifatini xalqaro standartlar asosida mustaqil baholash zaruriyatini yuzaga keltiradi. Ushbu yo‘nalishlar dissertatsiyaning III va IV boblarida ishlab chiqiladigan integral baholash metodikasi va erta ogohlantirish tizimining asosiy tamoyillari bo‘lib xizmat qiladi.</w:t>
       </w:r>
     </w:p>
-    <w:bookmarkEnd w:id="73"/>
+    <w:bookmarkEnd w:id="87"/>
     <w:sectPr>
       <w:pgMar w:left="1701" w:right="850" w:top="1134" w:bottom="1134"/>
     </w:sectPr>
@@ -6703,7 +7048,7 @@
         <w:t xml:space="preserve"> </w:t>
       </w:r>
       <w:r>
-        <w:t xml:space="preserve">Hendrickson J.M. Regulation and Instability in U.S. Commercial Banking: A History of Crises. – Basingstoke: Palgrave Macmillan, 2011. – P. 225–227.</w:t>
+        <w:t xml:space="preserve">Board of Governors of the Federal Reserve System. Revisions to the Large Financial Institution Rating System and Framework for the Supervision of Insurance Organizations // Federal Register. – 2025. – 17 November.</w:t>
       </w:r>
     </w:p>
   </w:footnote>
@@ -6722,7 +7067,7 @@
         <w:t xml:space="preserve"> </w:t>
       </w:r>
       <w:r>
-        <w:t xml:space="preserve">Оценка финансовой устойчивости кредитной организации: учебник / под ред. О.И. Лаврушина, И.Д. Мамоновой. – М.: КНОРУС, 2011. – С. 92–104.</w:t>
+        <w:t xml:space="preserve">Federal Financial Institutions Examination Council. Proposed Revisions to the Uniform Financial Institutions Rating System (CAMELS). – Washington, DC, 19 May 2026.</w:t>
       </w:r>
     </w:p>
   </w:footnote>
@@ -6741,7 +7086,7 @@
         <w:t xml:space="preserve"> </w:t>
       </w:r>
       <w:r>
-        <w:t xml:space="preserve">Устойчивость банковской системы и развитие банковской политики: монография / под ред. О.И. Лаврушина. – М.: КНОРУС, 2014. – С. 60–61.</w:t>
+        <w:t xml:space="preserve">Board of Governors of the Federal Reserve System. Modifications to the Capital Plan Rule and Stress Capital Buffer Requirement // Federal Register. – 2026. – 2 October; Federal Reserve Board finalizes changes to enhance the transparency and public accountability of its stress test: press release, 30 September 2026.</w:t>
       </w:r>
     </w:p>
   </w:footnote>
@@ -6760,7 +7105,7 @@
         <w:t xml:space="preserve"> </w:t>
       </w:r>
       <w:r>
-        <w:t xml:space="preserve">Tadqiqot natijasida muallif tomonidan quyidagi manba asosida ishlab chiqildi: Оценка финансовой устойчивости кредитной организации: учебник / под ред. О.И. Лаврушина, И.Д. Мамоновой. – М.: КНОРУС, 2011. – С. 105–106.</w:t>
+        <w:t xml:space="preserve">Board of Governors of the Federal Reserve System, Federal Deposit Insurance Corporation, Office of the Comptroller of the Currency. Regulatory capital proposals implementing the final Basel III standards. – Washington, DC, 19 March 2026.</w:t>
       </w:r>
     </w:p>
   </w:footnote>
@@ -6779,7 +7124,7 @@
         <w:t xml:space="preserve"> </w:t>
       </w:r>
       <w:r>
-        <w:t xml:space="preserve">Устойчивость банковской системы и развитие банковской политики: монография / под ред. О.И. Лаврушина. – М.: КНОРУС, 2014. – С. 59.</w:t>
+        <w:t xml:space="preserve">Hendrickson J.M. Regulation and Instability in U.S. Commercial Banking: A History of Crises. – Basingstoke: Palgrave Macmillan, 2011. – P. 225–227.</w:t>
       </w:r>
     </w:p>
   </w:footnote>
@@ -6798,7 +7143,7 @@
         <w:t xml:space="preserve"> </w:t>
       </w:r>
       <w:r>
-        <w:t xml:space="preserve">Оценка финансовой устойчивости кредитной организации: учебник / под ред. О.И. Лаврушина, И.Д. Мамоновой. – М.: КНОРУС, 2011. – С. 114–115.</w:t>
+        <w:t xml:space="preserve">Оценка финансовой устойчивости кредитной организации: учебник / под ред. О.И. Лаврушина, И.Д. Мамоновой. – М.: КНОРУС, 2011. – С. 92–104.</w:t>
       </w:r>
     </w:p>
   </w:footnote>
@@ -6817,7 +7162,7 @@
         <w:t xml:space="preserve"> </w:t>
       </w:r>
       <w:r>
-        <w:t xml:space="preserve">Karaliyev T.M., Sayfiddinov I.F. Tijorat banklari faoliyatini tartibga solish va nazorati: darslik. – T.: Iqtisod-Moliya, 2019. – B. 194–195.</w:t>
+        <w:t xml:space="preserve">Устойчивость банковской системы и развитие банковской политики: монография / под ред. О.И. Лаврушина. – М.: КНОРУС, 2014. – С. 60–61.</w:t>
       </w:r>
     </w:p>
   </w:footnote>
@@ -6836,7 +7181,7 @@
         <w:t xml:space="preserve"> </w:t>
       </w:r>
       <w:r>
-        <w:t xml:space="preserve">Tutino F., Brugnoni G.C., Siena M.G. Italian Banks Facing Basel 3 Higher Capital Requirements: Which Strategies Are Actually Feasible? // Bank Risk, Governance and Regulation / ed. by E. Beccalli, F. Poli. – Basingstoke: Palgrave Macmillan, 2015. – P. 212–231.</w:t>
+        <w:t xml:space="preserve">Tadqiqot natijasida muallif tomonidan quyidagi manba asosida ishlab chiqildi: Оценка финансовой устойчивости кредитной организации: учебник / под ред. О.И. Лаврушина, И.Д. Мамоновой. – М.: КНОРУС, 2011. – С. 105–106.</w:t>
       </w:r>
     </w:p>
   </w:footnote>
@@ -6855,7 +7200,7 @@
         <w:t xml:space="preserve"> </w:t>
       </w:r>
       <w:r>
-        <w:t xml:space="preserve">Gualandri E., Noera M. Towards a Macroprudential Policy in the EU // Bank Risk, Governance and Regulation / ed. by E. Beccalli, F. Poli. – Basingstoke: Palgrave Macmillan, 2015. – P. 199.</w:t>
+        <w:t xml:space="preserve">Устойчивость банковской системы и развитие банковской политики: монография / под ред. О.И. Лаврушина. – М.: КНОРУС, 2014. – С. 59.</w:t>
       </w:r>
     </w:p>
   </w:footnote>
@@ -6874,7 +7219,7 @@
         <w:t xml:space="preserve"> </w:t>
       </w:r>
       <w:r>
-        <w:t xml:space="preserve">Gualandri E., Noera M. Towards a Macroprudential Policy in the EU // Bank Risk, Governance and Regulation / ed. by E. Beccalli, F. Poli. – Basingstoke: Palgrave Macmillan, 2015. – P. 184–185.</w:t>
+        <w:t xml:space="preserve">Оценка финансовой устойчивости кредитной организации: учебник / под ред. О.И. Лаврушина, И.Д. Мамоновой. – М.: КНОРУС, 2011. – С. 114–115.</w:t>
       </w:r>
     </w:p>
   </w:footnote>
@@ -6893,7 +7238,7 @@
         <w:t xml:space="preserve"> </w:t>
       </w:r>
       <w:r>
-        <w:t xml:space="preserve">Cocozza R. Back to the Future: Prospective Bank Risk Management in a Financial Analysis Perspective // Bank Risk, Governance and Regulation / ed. by E. Beccalli, F. Poli. – Basingstoke: Palgrave Macmillan, 2015. – P. 111.</w:t>
+        <w:t xml:space="preserve">Karaliyev T.M., Sayfiddinov I.F. Tijorat banklari faoliyatini tartibga solish va nazorati: darslik. – T.: Iqtisod-Moliya, 2019. – B. 194–195.</w:t>
       </w:r>
     </w:p>
   </w:footnote>
@@ -6912,7 +7257,7 @@
         <w:t xml:space="preserve"> </w:t>
       </w:r>
       <w:r>
-        <w:t xml:space="preserve">Cocozza R. Back to the Future: Prospective Bank Risk Management in a Financial Analysis Perspective // Bank Risk, Governance and Regulation / ed. by E. Beccalli, F. Poli. – Basingstoke: Palgrave Macmillan, 2015. – P. 112–114.</w:t>
+        <w:t xml:space="preserve">Tutino F., Brugnoni G.C., Siena M.G. Italian Banks Facing Basel 3 Higher Capital Requirements: Which Strategies Are Actually Feasible? // Bank Risk, Governance and Regulation / ed. by E. Beccalli, F. Poli. – Basingstoke: Palgrave Macmillan, 2015. – P. 212–231.</w:t>
       </w:r>
     </w:p>
   </w:footnote>
@@ -6931,7 +7276,7 @@
         <w:t xml:space="preserve"> </w:t>
       </w:r>
       <w:r>
-        <w:t xml:space="preserve">Gualandri E., Noera M. Towards a Macroprudential Policy in the EU // Bank Risk, Governance and Regulation / ed. by E. Beccalli, F. Poli. – Basingstoke: Palgrave Macmillan, 2015. – P. 191–195.</w:t>
+        <w:t xml:space="preserve">Gualandri E., Noera M. Towards a Macroprudential Policy in the EU // Bank Risk, Governance and Regulation / ed. by E. Beccalli, F. Poli. – Basingstoke: Palgrave Macmillan, 2015. – P. 199.</w:t>
       </w:r>
     </w:p>
   </w:footnote>
@@ -6950,7 +7295,7 @@
         <w:t xml:space="preserve"> </w:t>
       </w:r>
       <w:r>
-        <w:t xml:space="preserve">Gualandri E., Noera M. Towards a Macroprudential Policy in the EU // Bank Risk, Governance and Regulation / ed. by E. Beccalli, F. Poli. – Basingstoke: Palgrave Macmillan, 2015. – P. 194–196.</w:t>
+        <w:t xml:space="preserve">Gualandri E., Noera M. Towards a Macroprudential Policy in the EU // Bank Risk, Governance and Regulation / ed. by E. Beccalli, F. Poli. – Basingstoke: Palgrave Macmillan, 2015. – P. 184–185.</w:t>
       </w:r>
     </w:p>
   </w:footnote>
@@ -6969,7 +7314,7 @@
         <w:t xml:space="preserve"> </w:t>
       </w:r>
       <w:r>
-        <w:t xml:space="preserve">Tadqiqot natijasida muallif tomonidan quyidagi manbalar asosida ishlab chiqildi: Оценка финансовой устойчивости кредитной организации: учебник / под ред. О.И. Лаврушина, И.Д. Мамоновой. – М.: КНОРУС, 2011. – С. 116–128; О приведении банковского регулирования в соответствие со стандартами Базельского комитета по банковскому надзору (Базель III) в условиях нестабильной экономической ситуации: монография / под ред. И.В. Ларионовой. – М.: КНОРУС. – С. 104–106.</w:t>
+        <w:t xml:space="preserve">Cocozza R. Back to the Future: Prospective Bank Risk Management in a Financial Analysis Perspective // Bank Risk, Governance and Regulation / ed. by E. Beccalli, F. Poli. – Basingstoke: Palgrave Macmillan, 2015. – P. 111.</w:t>
       </w:r>
     </w:p>
   </w:footnote>
@@ -6988,7 +7333,7 @@
         <w:t xml:space="preserve"> </w:t>
       </w:r>
       <w:r>
-        <w:t xml:space="preserve">Оценка финансовой устойчивости кредитной организации: учебник / под ред. О.И. Лаврушина, И.Д. Мамоновой. – М.: КНОРУС, 2011. – С. 135.</w:t>
+        <w:t xml:space="preserve">Cocozza R. Back to the Future: Prospective Bank Risk Management in a Financial Analysis Perspective // Bank Risk, Governance and Regulation / ed. by E. Beccalli, F. Poli. – Basingstoke: Palgrave Macmillan, 2015. – P. 112–114.</w:t>
       </w:r>
     </w:p>
   </w:footnote>
@@ -7007,7 +7352,7 @@
         <w:t xml:space="preserve"> </w:t>
       </w:r>
       <w:r>
-        <w:t xml:space="preserve">Устойчивость банковской системы и развитие банковской политики: монография / под ред. О.И. Лаврушина. – М.: КНОРУС, 2014. – С. 48–49.</w:t>
+        <w:t xml:space="preserve">Gualandri E., Noera M. Towards a Macroprudential Policy in the EU // Bank Risk, Governance and Regulation / ed. by E. Beccalli, F. Poli. – Basingstoke: Palgrave Macmillan, 2015. – P. 191–195.</w:t>
       </w:r>
     </w:p>
   </w:footnote>
@@ -7026,7 +7371,7 @@
         <w:t xml:space="preserve"> </w:t>
       </w:r>
       <w:r>
-        <w:t xml:space="preserve">Оценка финансовой устойчивости кредитной организации: учебник / под ред. О.И. Лаврушина, И.Д. Мамоновой. – М.: КНОРУС, 2011. – С. 139.</w:t>
+        <w:t xml:space="preserve">Gualandri E., Noera M. Towards a Macroprudential Policy in the EU // Bank Risk, Governance and Regulation / ed. by E. Beccalli, F. Poli. – Basingstoke: Palgrave Macmillan, 2015. – P. 194–196.</w:t>
       </w:r>
     </w:p>
   </w:footnote>
@@ -7045,7 +7390,7 @@
         <w:t xml:space="preserve"> </w:t>
       </w:r>
       <w:r>
-        <w:t xml:space="preserve">О приведении банковского регулирования в соответствие со стандартами Базельского комитета по банковскому надзору (Базель III) в условиях нестабильной экономической ситуации: монография / под ред. И.В. Ларионовой. – М.: КНОРУС. – С. 70, 72.</w:t>
+        <w:t xml:space="preserve">Regulation (EU) 2024/1623 of the European Parliament and of the Council of 31 May 2024 amending Regulation (EU) No 575/2013 as regards requirements for credit risk, credit valuation adjustment risk, operational risk, market risk and the output floor // Official Journal of the European Union. – 2024. – 19 June.</w:t>
       </w:r>
     </w:p>
   </w:footnote>
@@ -7064,7 +7409,7 @@
         <w:t xml:space="preserve"> </w:t>
       </w:r>
       <w:r>
-        <w:t xml:space="preserve">Tadqiqot natijasida muallif tomonidan quyidagi manbalar ma’lumotlari asosida ishlab chiqildi: Basel Committee on Banking Supervision. Basel III: The Liquidity Coverage Ratio and liquidity risk monitoring tools. – Basel: BIS, 2013; О приведении банковского регулирования в соответствие со стандартами Базельского комитета по банковскому надзору (Базель III) в условиях нестабильной экономической ситуации: монография / под ред. И.В. Ларионовой. – М.: КНОРУС. – С. 70; Karaliyev T.M., Sayfiddinov I.F. Tijorat banklari faoliyatini tartibga solish va nazorati: darslik. – T.: Iqtisod-Moliya, 2019. – B. 185.</w:t>
+        <w:t xml:space="preserve">Prudential Regulation Authority. The PRA announces a delay to the implementation of Basel 3.1: press release. – London: Bank of England, 17 January 2025.</w:t>
       </w:r>
     </w:p>
   </w:footnote>
@@ -7083,7 +7428,7 @@
         <w:t xml:space="preserve"> </w:t>
       </w:r>
       <w:r>
-        <w:t xml:space="preserve">О приведении банковского регулирования в соответствие со стандартами Базельского комитета по банковскому надзору (Базель III) в условиях нестабильной экономической ситуации: монография / под ред. И.В. Ларионовой. – М.: КНОРУС. – С. 77, 79–80.</w:t>
+        <w:t xml:space="preserve">European Banking Authority. 2025 EU-wide stress test: Results. – Paris: EBA, 1 August 2025.</w:t>
       </w:r>
     </w:p>
   </w:footnote>
@@ -7102,7 +7447,7 @@
         <w:t xml:space="preserve"> </w:t>
       </w:r>
       <w:r>
-        <w:t xml:space="preserve">О приведении банковского регулирования в соответствие со стандартами Базельского комитета по банковскому надзору (Базель III) в условиях нестабильной экономической ситуации: монография / под ред. И.В. Ларионовой. – М.: КНОРУС. – С. 60–67.</w:t>
+        <w:t xml:space="preserve">Tadqiqot natijasida muallif tomonidan quyidagi manbalar asosida ishlab chiqildi: Оценка финансовой устойчивости кредитной организации: учебник / под ред. О.И. Лаврушина, И.Д. Мамоновой. – М.: КНОРУС, 2011. – С. 116–128; О приведении банковского регулирования в соответствие со стандартами Базельского комитета по банковскому надзору (Базель III) в условиях нестабильной экономической ситуации: монография / под ред. И.В. Ларионовой. – М.: КНОРУС. – С. 104–106.</w:t>
       </w:r>
     </w:p>
   </w:footnote>
@@ -7121,7 +7466,7 @@
         <w:t xml:space="preserve"> </w:t>
       </w:r>
       <w:r>
-        <w:t xml:space="preserve">Регулирование банковской сферы: учебник / под ред. О.Н. Афанасьевой, С.Е. Дубовой. – М.: КНОРУС. – С. 47–49.</w:t>
+        <w:t xml:space="preserve">Оценка финансовой устойчивости кредитной организации: учебник / под ред. О.И. Лаврушина, И.Д. Мамоновой. – М.: КНОРУС, 2011. – С. 135.</w:t>
       </w:r>
     </w:p>
   </w:footnote>
@@ -7140,7 +7485,7 @@
         <w:t xml:space="preserve"> </w:t>
       </w:r>
       <w:r>
-        <w:t xml:space="preserve">Tadqiqot natijasida muallif tomonidan quyidagi manbalar asosida ishlab chiqildi: Регулирование банковской сферы: учебник / под ред. О.Н. Афанасьевой, С.Е. Дубовой. – М.: КНОРУС. – С. 48–49; Cargill T.F. The Financial System, Financial Regulation and Central Bank Policy. – Cambridge: Cambridge University Press, 2017. – P. 195–196.</w:t>
+        <w:t xml:space="preserve">Устойчивость банковской системы и развитие банковской политики: монография / под ред. О.И. Лаврушина. – М.: КНОРУС, 2014. – С. 48–49.</w:t>
       </w:r>
     </w:p>
   </w:footnote>
@@ -7159,7 +7504,7 @@
         <w:t xml:space="preserve"> </w:t>
       </w:r>
       <w:r>
-        <w:t xml:space="preserve">Регулирование банковской сферы: учебник / под ред. О.Н. Афанасьевой, С.Е. Дубовой. – М.: КНОРУС. – С. 53.</w:t>
+        <w:t xml:space="preserve">Оценка финансовой устойчивости кредитной организации: учебник / под ред. О.И. Лаврушина, И.Д. Мамоновой. – М.: КНОРУС, 2011. – С. 139.</w:t>
       </w:r>
     </w:p>
   </w:footnote>
@@ -7178,7 +7523,7 @@
         <w:t xml:space="preserve"> </w:t>
       </w:r>
       <w:r>
-        <w:t xml:space="preserve">Устойчивость банковской системы и развитие банковской политики: монография / под ред. О.И. Лаврушина. – М.: КНОРУС, 2014. – С. 143, 146.</w:t>
+        <w:t xml:space="preserve">О приведении банковского регулирования в соответствие со стандартами Базельского комитета по банковскому надзору (Базель III) в условиях нестабильной экономической ситуации: монография / под ред. И.В. Ларионовой. – М.: КНОРУС. – С. 70, 72.</w:t>
       </w:r>
     </w:p>
   </w:footnote>
@@ -7197,7 +7542,7 @@
         <w:t xml:space="preserve"> </w:t>
       </w:r>
       <w:r>
-        <w:t xml:space="preserve">He Wei Ping. Banking Regulation in China: The Role of Public and Private Sectors. – New York: Palgrave Macmillan, 2014. – P. 52.</w:t>
+        <w:t xml:space="preserve">Tadqiqot natijasida muallif tomonidan quyidagi manbalar ma’lumotlari asosida ishlab chiqildi: Basel Committee on Banking Supervision. Basel III: The Liquidity Coverage Ratio and liquidity risk monitoring tools. – Basel: BIS, 2013; О приведении банковского регулирования в соответствие со стандартами Базельского комитета по банковскому надзору (Базель III) в условиях нестабильной экономической ситуации: монография / под ред. И.В. Ларионовой. – М.: КНОРУС. – С. 70; Karaliyev T.M., Sayfiddinov I.F. Tijorat banklari faoliyatini tartibga solish va nazorati: darslik. – T.: Iqtisod-Moliya, 2019. – B. 185; Банк России устанавливает порядок выхода из послабления по нормативу краткосрочной ликвидности и предоставляет безотзывные кредитные линии: пресс-релиз Банка России. – М., 2023; ЦБ скорректировал условия кредитным линиям для банковского норматива краткосрочной ликвидности // Интерфакс. – 2025; Национальный норматив краткосрочной ликвидности для СЗКО: порядок расчета: информация Банка России от 12 августа 2025 г. – https://www.cbr.ru/press/event/?id=26840</w:t>
       </w:r>
     </w:p>
   </w:footnote>
@@ -7216,7 +7561,7 @@
         <w:t xml:space="preserve"> </w:t>
       </w:r>
       <w:r>
-        <w:t xml:space="preserve">He Wei Ping. Banking Regulation in China: The Role of Public and Private Sectors. – New York: Palgrave Macmillan, 2014. – P. 55.</w:t>
+        <w:t xml:space="preserve">О приведении банковского регулирования в соответствие со стандартами Базельского комитета по банковскому надзору (Базель III) в условиях нестабильной экономической ситуации: монография / под ред. И.В. Ларионовой. – М.: КНОРУС. – С. 77, 79–80.</w:t>
       </w:r>
     </w:p>
   </w:footnote>
@@ -7235,7 +7580,7 @@
         <w:t xml:space="preserve"> </w:t>
       </w:r>
       <w:r>
-        <w:t xml:space="preserve">О приведении банковского регулирования в соответствие со стандартами Базельского комитета по банковскому надзору (Базель III) в условиях нестабильной экономической ситуации: монография / под ред. И.В. Ларионовой. – М.: КНОРУС. – С. 142–144.</w:t>
+        <w:t xml:space="preserve">Банк России устанавливает порядок выхода из послабления по нормативу краткосрочной ликвидности и предоставляет безотзывные кредитные линии: пресс-релиз Банка России. – М., 2023; ЦБ скорректировал условия кредитным линиям для банковского норматива краткосрочной ликвидности // Интерфакс. – 2025.</w:t>
       </w:r>
     </w:p>
   </w:footnote>
@@ -7254,7 +7599,7 @@
         <w:t xml:space="preserve"> </w:t>
       </w:r>
       <w:r>
-        <w:t xml:space="preserve">О приведении банковского регулирования в соответствие со стандартами Базельского комитета по банковскому надзору (Базель III) в условиях нестабильной экономической ситуации: монография / под ред. И.В. Ларионовой. – М.: КНОРУС. – С. 142–144.</w:t>
+        <w:t xml:space="preserve">Национальный норматив краткосрочной ликвидности для СЗКО: порядок расчета: информация Банка России от 12 августа 2025 г. – https://www.cbr.ru/press/event/?id=26840</w:t>
       </w:r>
     </w:p>
   </w:footnote>
@@ -7273,7 +7618,7 @@
         <w:t xml:space="preserve"> </w:t>
       </w:r>
       <w:r>
-        <w:t xml:space="preserve">International Monetary Fund. Global Financial Stability Report: Potent Policies for a Successful Normalization. – Washington, DC: IMF, April 2016.</w:t>
+        <w:t xml:space="preserve">O‘zbekiston Respublikasi Markaziy banki. Moliya sektorini baholash dasturi (FSAP) tavsiyalarini amalga oshirish bo‘yicha 2025–2028-yillarga mo‘ljallangan «yo‘l xaritasi».</w:t>
       </w:r>
     </w:p>
   </w:footnote>
@@ -7292,7 +7637,7 @@
         <w:t xml:space="preserve"> </w:t>
       </w:r>
       <w:r>
-        <w:t xml:space="preserve">National Financial Regulatory Administration. Supervisory Statistics of the Banking and Insurance Sectors: 2023-yil IV chorak, 2024-yil IV chorak, 2025-yil III chorak. – https://www.nfra.gov.cn/en/</w:t>
+        <w:t xml:space="preserve">Basel Committee on Banking Supervision. Report on the 2023 banking turmoil. – Basel: BIS, October 2023.</w:t>
       </w:r>
     </w:p>
   </w:footnote>
@@ -7311,7 +7656,7 @@
         <w:t xml:space="preserve"> </w:t>
       </w:r>
       <w:r>
-        <w:t xml:space="preserve">International Monetary Fund. People’s Republic of China: 2025 Article IV Consultation – Press Release; Staff Report; and Statement by the Executive Director. IMF Country Report No. 26/44. – Washington, DC: IMF, 2026.</w:t>
+        <w:t xml:space="preserve">О приведении банковского регулирования в соответствие со стандартами Базельского комитета по банковскому надзору (Базель III) в условиях нестабильной экономической ситуации: монография / под ред. И.В. Ларионовой. – М.: КНОРУС. – С. 60–67.</w:t>
       </w:r>
     </w:p>
   </w:footnote>
@@ -7330,7 +7675,7 @@
         <w:t xml:space="preserve"> </w:t>
       </w:r>
       <w:r>
-        <w:t xml:space="preserve">Charoenwong B., Miao M., Ruan T. Nonperforming Loan Disposals Without Resolution // Management Science. – 2025. – Vol. 71, No. 1. – P. 898–916.</w:t>
+        <w:t xml:space="preserve">Регулирование банковской сферы: учебник / под ред. О.Н. Афанасьевой, С.Е. Дубовой. – М.: КНОРУС. – С. 47–49.</w:t>
       </w:r>
     </w:p>
   </w:footnote>
@@ -7349,7 +7694,7 @@
         <w:t xml:space="preserve"> </w:t>
       </w:r>
       <w:r>
-        <w:t xml:space="preserve">Tadqiqot natijasida muallif tomonidan quyidagi manbalar ma’lumotlari asosida ishlab chiqildi: National Financial Regulatory Administration. Supervisory Statistics of the Banking and Insurance Sectors: 2023-yil IV chorak, 2024-yil IV chorak, 2025-yil III chorak. – https://www.nfra.gov.cn/en; International Monetary Fund. People’s Republic of China: 2025 Article IV Consultation – Press Release; Staff Report; and Statement by the Executive Director. IMF Country Report No. 26/44. – Washington, DC: IMF, 2026; Charoenwong B., Miao M., Ruan T. Nonperforming Loan Disposals Without Resolution // Management Science. – 2025. – Vol. 71, No. 1. – P. 898–916; International Monetary Fund. Global Financial Stability Report: Potent Policies for a Successful Normalization. – Washington, DC: IMF, April 2016.</w:t>
+        <w:t xml:space="preserve">Банк России. Национальная антициклическая надбавка: решение Совета директоров от 8 ноября 2024 г. – https://www.cbr.ru/finstab/instruments/ccb/</w:t>
       </w:r>
     </w:p>
   </w:footnote>
@@ -7368,7 +7713,7 @@
         <w:t xml:space="preserve"> </w:t>
       </w:r>
       <w:r>
-        <w:t xml:space="preserve">International Monetary Fund. People’s Republic of China: 2025 Article IV Consultation – Press Release; Staff Report; and Statement by the Executive Director. IMF Country Report No. 26/44. – Washington, DC: IMF, 2026.</w:t>
+        <w:t xml:space="preserve">Tadqiqot natijasida muallif tomonidan quyidagi manbalar asosida ishlab chiqildi: Регулирование банковской сферы: учебник / под ред. О.Н. Афанасьевой, С.Е. Дубовой. – М.: КНОРУС. – С. 48–49; Cargill T.F. The Financial System, Financial Regulation and Central Bank Policy. – Cambridge: Cambridge University Press, 2017. – P. 195–196.</w:t>
       </w:r>
     </w:p>
   </w:footnote>
@@ -7387,7 +7732,7 @@
         <w:t xml:space="preserve"> </w:t>
       </w:r>
       <w:r>
-        <w:t xml:space="preserve">He Wei Ping. Banking Regulation in China: The Role of Public and Private Sectors. – New York: Palgrave Macmillan, 2014. – P. 68, 135.</w:t>
+        <w:t xml:space="preserve">Регулирование банковской сферы: учебник / под ред. О.Н. Афанасьевой, С.Е. Дубовой. – М.: КНОРУС. – С. 53.</w:t>
       </w:r>
     </w:p>
   </w:footnote>
@@ -7406,7 +7751,7 @@
         <w:t xml:space="preserve"> </w:t>
       </w:r>
       <w:r>
-        <w:t xml:space="preserve">О приведении банковского регулирования в соответствие со стандартами Базельского комитета по банковскому надзору (Базель III) в условиях нестабильной экономической ситуации: монография / под ред. И.В. Ларионовой. – М.: КНОРУС. – С. 118–124.</w:t>
+        <w:t xml:space="preserve">Устойчивость банковской системы и развитие банковской политики: монография / под ред. О.И. Лаврушина. – М.: КНОРУС, 2014. – С. 143, 146.</w:t>
       </w:r>
     </w:p>
   </w:footnote>
@@ -7425,7 +7770,7 @@
         <w:t xml:space="preserve"> </w:t>
       </w:r>
       <w:r>
-        <w:t xml:space="preserve">О приведении банковского регулирования в соответствие со стандартами Базельского комитета по банковскому надзору (Базель III) в условиях нестабильной экономической ситуации: монография / под ред. И.В. Ларионовой. – М.: КНОРУС. – С. 138–140.</w:t>
+        <w:t xml:space="preserve">He Wei Ping. Banking Regulation in China: The Role of Public and Private Sectors. – New York: Palgrave Macmillan, 2014. – P. 52.</w:t>
       </w:r>
     </w:p>
   </w:footnote>
@@ -7444,11 +7789,277 @@
         <w:t xml:space="preserve"> </w:t>
       </w:r>
       <w:r>
-        <w:t xml:space="preserve">О приведении банковского регулирования в соответствие со стандартами Базельского комитета по банковскому надзору (Базель III) в условиях нестабильной экономической ситуации: монография / под ред. И.В. Ларионовой. – М.: КНОРУС. – С. 134.</w:t>
+        <w:t xml:space="preserve">He Wei Ping. Banking Regulation in China: The Role of Public and Private Sectors. – New York: Palgrave Macmillan, 2014. – P. 55.</w:t>
       </w:r>
     </w:p>
   </w:footnote>
   <w:footnote w:id="72">
+    <w:p>
+      <w:pPr>
+        <w:pStyle w:val="FootnoteText"/>
+      </w:pPr>
+      <w:r>
+        <w:rPr>
+          <w:rStyle w:val="FootnoteReference"/>
+        </w:rPr>
+        <w:footnoteRef/>
+      </w:r>
+      <w:r>
+        <w:t xml:space="preserve"> </w:t>
+      </w:r>
+      <w:r>
+        <w:t xml:space="preserve">Law of the People’s Republic of China on Commercial Banks (2015 Amendment). – Beijing: Standing Committee of the National People’s Congress, 29 August 2015.</w:t>
+      </w:r>
+    </w:p>
+  </w:footnote>
+  <w:footnote w:id="73">
+    <w:p>
+      <w:pPr>
+        <w:pStyle w:val="FootnoteText"/>
+      </w:pPr>
+      <w:r>
+        <w:rPr>
+          <w:rStyle w:val="FootnoteReference"/>
+        </w:rPr>
+        <w:footnoteRef/>
+      </w:r>
+      <w:r>
+        <w:t xml:space="preserve"> </w:t>
+      </w:r>
+      <w:r>
+        <w:t xml:space="preserve">О приведении банковского регулирования в соответствие со стандартами Базельского комитета по банковскому надзору (Базель III) в условиях нестабильной экономической ситуации: монография / под ред. И.В. Ларионовой. – М.: КНОРУС. – С. 142–144.</w:t>
+      </w:r>
+    </w:p>
+  </w:footnote>
+  <w:footnote w:id="74">
+    <w:p>
+      <w:pPr>
+        <w:pStyle w:val="FootnoteText"/>
+      </w:pPr>
+      <w:r>
+        <w:rPr>
+          <w:rStyle w:val="FootnoteReference"/>
+        </w:rPr>
+        <w:footnoteRef/>
+      </w:r>
+      <w:r>
+        <w:t xml:space="preserve"> </w:t>
+      </w:r>
+      <w:r>
+        <w:t xml:space="preserve">National Financial Regulatory Administration. Measures for the Capital Management of Commercial Banks. – Beijing, 2023 (2024-yil 1-yanvardan kuchga kirgan).</w:t>
+      </w:r>
+    </w:p>
+  </w:footnote>
+  <w:footnote w:id="75">
+    <w:p>
+      <w:pPr>
+        <w:pStyle w:val="FootnoteText"/>
+      </w:pPr>
+      <w:r>
+        <w:rPr>
+          <w:rStyle w:val="FootnoteReference"/>
+        </w:rPr>
+        <w:footnoteRef/>
+      </w:r>
+      <w:r>
+        <w:t xml:space="preserve"> </w:t>
+      </w:r>
+      <w:r>
+        <w:t xml:space="preserve">О приведении банковского регулирования в соответствие со стандартами Базельского комитета по банковскому надзору (Базель III) в условиях нестабильной экономической ситуации: монография / под ред. И.В. Ларионовой. – М.: КНОРУС. – С. 142–144.</w:t>
+      </w:r>
+    </w:p>
+  </w:footnote>
+  <w:footnote w:id="76">
+    <w:p>
+      <w:pPr>
+        <w:pStyle w:val="FootnoteText"/>
+      </w:pPr>
+      <w:r>
+        <w:rPr>
+          <w:rStyle w:val="FootnoteReference"/>
+        </w:rPr>
+        <w:footnoteRef/>
+      </w:r>
+      <w:r>
+        <w:t xml:space="preserve"> </w:t>
+      </w:r>
+      <w:r>
+        <w:t xml:space="preserve">International Monetary Fund. Global Financial Stability Report: Potent Policies for a Successful Normalization. – Washington, DC: IMF, April 2016.</w:t>
+      </w:r>
+    </w:p>
+  </w:footnote>
+  <w:footnote w:id="77">
+    <w:p>
+      <w:pPr>
+        <w:pStyle w:val="FootnoteText"/>
+      </w:pPr>
+      <w:r>
+        <w:rPr>
+          <w:rStyle w:val="FootnoteReference"/>
+        </w:rPr>
+        <w:footnoteRef/>
+      </w:r>
+      <w:r>
+        <w:t xml:space="preserve"> </w:t>
+      </w:r>
+      <w:r>
+        <w:t xml:space="preserve">National Financial Regulatory Administration. Supervisory Statistics of the Banking and Insurance Sectors: 2023-yil IV chorak, 2024-yil IV chorak, 2025-yil III chorak. – https://www.nfra.gov.cn/en/</w:t>
+      </w:r>
+    </w:p>
+  </w:footnote>
+  <w:footnote w:id="78">
+    <w:p>
+      <w:pPr>
+        <w:pStyle w:val="FootnoteText"/>
+      </w:pPr>
+      <w:r>
+        <w:rPr>
+          <w:rStyle w:val="FootnoteReference"/>
+        </w:rPr>
+        <w:footnoteRef/>
+      </w:r>
+      <w:r>
+        <w:t xml:space="preserve"> </w:t>
+      </w:r>
+      <w:r>
+        <w:t xml:space="preserve">International Monetary Fund. People’s Republic of China: 2025 Article IV Consultation – Press Release; Staff Report; and Statement by the Executive Director. IMF Country Report No. 26/44. – Washington, DC: IMF, 2026.</w:t>
+      </w:r>
+    </w:p>
+  </w:footnote>
+  <w:footnote w:id="79">
+    <w:p>
+      <w:pPr>
+        <w:pStyle w:val="FootnoteText"/>
+      </w:pPr>
+      <w:r>
+        <w:rPr>
+          <w:rStyle w:val="FootnoteReference"/>
+        </w:rPr>
+        <w:footnoteRef/>
+      </w:r>
+      <w:r>
+        <w:t xml:space="preserve"> </w:t>
+      </w:r>
+      <w:r>
+        <w:t xml:space="preserve">Charoenwong B., Miao M., Ruan T. Nonperforming Loan Disposals Without Resolution // Management Science. – 2025. – Vol. 71, No. 1. – P. 898–916.</w:t>
+      </w:r>
+    </w:p>
+  </w:footnote>
+  <w:footnote w:id="80">
+    <w:p>
+      <w:pPr>
+        <w:pStyle w:val="FootnoteText"/>
+      </w:pPr>
+      <w:r>
+        <w:rPr>
+          <w:rStyle w:val="FootnoteReference"/>
+        </w:rPr>
+        <w:footnoteRef/>
+      </w:r>
+      <w:r>
+        <w:t xml:space="preserve"> </w:t>
+      </w:r>
+      <w:r>
+        <w:t xml:space="preserve">Tadqiqot natijasida muallif tomonidan quyidagi manbalar ma’lumotlari asosida ishlab chiqildi: National Financial Regulatory Administration. Supervisory Statistics of the Banking and Insurance Sectors: 2023-yil IV chorak, 2024-yil IV chorak, 2025-yil III chorak. – https://www.nfra.gov.cn/en; International Monetary Fund. People’s Republic of China: 2025 Article IV Consultation – Press Release; Staff Report; and Statement by the Executive Director. IMF Country Report No. 26/44. – Washington, DC: IMF, 2026; Charoenwong B., Miao M., Ruan T. Nonperforming Loan Disposals Without Resolution // Management Science. – 2025. – Vol. 71, No. 1. – P. 898–916; International Monetary Fund. Global Financial Stability Report: Potent Policies for a Successful Normalization. – Washington, DC: IMF, April 2016.</w:t>
+      </w:r>
+    </w:p>
+  </w:footnote>
+  <w:footnote w:id="81">
+    <w:p>
+      <w:pPr>
+        <w:pStyle w:val="FootnoteText"/>
+      </w:pPr>
+      <w:r>
+        <w:rPr>
+          <w:rStyle w:val="FootnoteReference"/>
+        </w:rPr>
+        <w:footnoteRef/>
+      </w:r>
+      <w:r>
+        <w:t xml:space="preserve"> </w:t>
+      </w:r>
+      <w:r>
+        <w:t xml:space="preserve">International Monetary Fund. People’s Republic of China: 2025 Article IV Consultation – Press Release; Staff Report; and Statement by the Executive Director. IMF Country Report No. 26/44. – Washington, DC: IMF, 2026.</w:t>
+      </w:r>
+    </w:p>
+  </w:footnote>
+  <w:footnote w:id="82">
+    <w:p>
+      <w:pPr>
+        <w:pStyle w:val="FootnoteText"/>
+      </w:pPr>
+      <w:r>
+        <w:rPr>
+          <w:rStyle w:val="FootnoteReference"/>
+        </w:rPr>
+        <w:footnoteRef/>
+      </w:r>
+      <w:r>
+        <w:t xml:space="preserve"> </w:t>
+      </w:r>
+      <w:r>
+        <w:t xml:space="preserve">He Wei Ping. Banking Regulation in China: The Role of Public and Private Sectors. – New York: Palgrave Macmillan, 2014. – P. 68, 135.</w:t>
+      </w:r>
+    </w:p>
+  </w:footnote>
+  <w:footnote w:id="83">
+    <w:p>
+      <w:pPr>
+        <w:pStyle w:val="FootnoteText"/>
+      </w:pPr>
+      <w:r>
+        <w:rPr>
+          <w:rStyle w:val="FootnoteReference"/>
+        </w:rPr>
+        <w:footnoteRef/>
+      </w:r>
+      <w:r>
+        <w:t xml:space="preserve"> </w:t>
+      </w:r>
+      <w:r>
+        <w:t xml:space="preserve">О приведении банковского регулирования в соответствие со стандартами Базельского комитета по банковскому надзору (Базель III) в условиях нестабильной экономической ситуации: монография / под ред. И.В. Ларионовой. – М.: КНОРУС. – С. 118–124.</w:t>
+      </w:r>
+    </w:p>
+  </w:footnote>
+  <w:footnote w:id="84">
+    <w:p>
+      <w:pPr>
+        <w:pStyle w:val="FootnoteText"/>
+      </w:pPr>
+      <w:r>
+        <w:rPr>
+          <w:rStyle w:val="FootnoteReference"/>
+        </w:rPr>
+        <w:footnoteRef/>
+      </w:r>
+      <w:r>
+        <w:t xml:space="preserve"> </w:t>
+      </w:r>
+      <w:r>
+        <w:t xml:space="preserve">О приведении банковского регулирования в соответствие со стандартами Базельского комитета по банковскому надзору (Базель III) в условиях нестабильной экономической ситуации: монография / под ред. И.В. Ларионовой. – М.: КНОРУС. – С. 138–140.</w:t>
+      </w:r>
+    </w:p>
+  </w:footnote>
+  <w:footnote w:id="85">
+    <w:p>
+      <w:pPr>
+        <w:pStyle w:val="FootnoteText"/>
+      </w:pPr>
+      <w:r>
+        <w:rPr>
+          <w:rStyle w:val="FootnoteReference"/>
+        </w:rPr>
+        <w:footnoteRef/>
+      </w:r>
+      <w:r>
+        <w:t xml:space="preserve"> </w:t>
+      </w:r>
+      <w:r>
+        <w:t xml:space="preserve">О приведении банковского регулирования в соответствие со стандартами Базельского комитета по банковскому надзору (Базель III) в условиях нестабильной экономической ситуации: монография / под ред. И.В. Ларионовой. – М.: КНОРУС. – С. 134.</w:t>
+      </w:r>
+    </w:p>
+  </w:footnote>
+  <w:footnote w:id="86">
     <w:p>
       <w:pPr>
         <w:pStyle w:val="FootnoteText"/>
@@ -8730,9 +9341,8 @@
     <c:autoTitleDeleted val="1"/>
     <c:plotArea>
       <c:layout/>
-      <c:barChart>
-        <c:barDir val="col"/>
-        <c:grouping val="clustered"/>
+      <c:scatterChart>
+        <c:scatterStyle val="lineMarker"/>
         <c:varyColors val="0"/>
         <c:ser>
           <c:idx val="0"/>
@@ -8749,18 +9359,46 @@
             </c:strRef>
           </c:tx>
           <c:spPr>
-            <a:solidFill>
-              <a:srgbClr val="2A78D6"/>
-            </a:solidFill>
-            <a:ln w="6350">
+            <a:ln w="76200">
               <a:solidFill>
-                <a:srgbClr val="FFFFFF"/>
+                <a:srgbClr val="2A78D6">
+                  <a:alpha val="35000"/>
+                </a:srgbClr>
               </a:solidFill>
             </a:ln>
           </c:spPr>
-          <c:invertIfNegative val="0"/>
+          <c:marker>
+            <c:symbol val="none"/>
+          </c:marker>
           <c:dLbls>
-            <c:numFmt formatCode="0" sourceLinked="0"/>
+            <c:dLbl>
+              <c:idx val="5"/>
+              <c:delete val="1"/>
+            </c:dLbl>
+            <c:dLbl>
+              <c:idx val="6"/>
+              <c:delete val="1"/>
+            </c:dLbl>
+            <c:dLbl>
+              <c:idx val="7"/>
+              <c:delete val="1"/>
+            </c:dLbl>
+            <c:dLbl>
+              <c:idx val="8"/>
+              <c:delete val="1"/>
+            </c:dLbl>
+            <c:dLbl>
+              <c:idx val="9"/>
+              <c:delete val="1"/>
+            </c:dLbl>
+            <c:dLbl>
+              <c:idx val="10"/>
+              <c:delete val="1"/>
+            </c:dLbl>
+            <c:dLbl>
+              <c:idx val="11"/>
+              <c:delete val="1"/>
+            </c:dLbl>
             <c:spPr>
               <a:noFill/>
               <a:ln>
@@ -8772,9 +9410,9 @@
               <a:lstStyle/>
               <a:p>
                 <a:pPr>
-                  <a:defRPr sz="1050" b="1">
+                  <a:defRPr sz="1000" b="1">
                     <a:solidFill>
-                      <a:srgbClr val="000000"/>
+                      <a:srgbClr val="1F4E79"/>
                     </a:solidFill>
                     <a:latin typeface="Times New Roman"/>
                     <a:cs typeface="Times New Roman"/>
@@ -8783,7 +9421,7 @@
                 <a:endParaRPr lang="uz-Latn-UZ"/>
               </a:p>
             </c:txPr>
-            <c:dLblPos val="outEnd"/>
+            <c:dLblPos val="b"/>
             <c:showLegendKey val="0"/>
             <c:showVal val="1"/>
             <c:showCatName val="0"/>
@@ -8791,11 +9429,12 @@
             <c:showPercent val="0"/>
             <c:showBubbleSize val="0"/>
           </c:dLbls>
-          <c:cat>
-            <c:strRef>
-              <c:f>Sheet1!$A$2:$A$6</c:f>
-              <c:strCache>
-                <c:ptCount val="5"/>
+          <c:xVal>
+            <c:numRef>
+              <c:f>Sheet1!$A$2:$A$13</c:f>
+              <c:numCache>
+                <c:formatCode>General</c:formatCode>
+                <c:ptCount val="12"/>
                 <c:pt idx="0">
                   <c:v>2015</c:v>
                 </c:pt>
@@ -8811,15 +9450,36 @@
                 <c:pt idx="4">
                   <c:v>2019</c:v>
                 </c:pt>
-              </c:strCache>
-            </c:strRef>
-          </c:cat>
-          <c:val>
+                <c:pt idx="5">
+                  <c:v>2020</c:v>
+                </c:pt>
+                <c:pt idx="6">
+                  <c:v>2021</c:v>
+                </c:pt>
+                <c:pt idx="7">
+                  <c:v>2022</c:v>
+                </c:pt>
+                <c:pt idx="8">
+                  <c:v>2023</c:v>
+                </c:pt>
+                <c:pt idx="9">
+                  <c:v>2024</c:v>
+                </c:pt>
+                <c:pt idx="10">
+                  <c:v>2025</c:v>
+                </c:pt>
+                <c:pt idx="11">
+                  <c:v>2026</c:v>
+                </c:pt>
+              </c:numCache>
+            </c:numRef>
+          </c:xVal>
+          <c:yVal>
             <c:numRef>
-              <c:f>Sheet1!$B$2:$B$6</c:f>
+              <c:f>Sheet1!$B$2:$B$13</c:f>
               <c:numCache>
                 <c:formatCode>General</c:formatCode>
-                <c:ptCount val="5"/>
+                <c:ptCount val="12"/>
                 <c:pt idx="0">
                   <c:v>60</c:v>
                 </c:pt>
@@ -8835,37 +9495,102 @@
                 <c:pt idx="4">
                   <c:v>100</c:v>
                 </c:pt>
+                <c:pt idx="5">
+                  <c:v>100</c:v>
+                </c:pt>
+                <c:pt idx="6">
+                  <c:v>100</c:v>
+                </c:pt>
+                <c:pt idx="7">
+                  <c:v>100</c:v>
+                </c:pt>
+                <c:pt idx="8">
+                  <c:v>100</c:v>
+                </c:pt>
+                <c:pt idx="9">
+                  <c:v>100</c:v>
+                </c:pt>
+                <c:pt idx="10">
+                  <c:v>100</c:v>
+                </c:pt>
+                <c:pt idx="11">
+                  <c:v>100</c:v>
+                </c:pt>
               </c:numCache>
             </c:numRef>
-          </c:val>
+          </c:yVal>
+          <c:smooth val="0"/>
         </c:ser>
         <c:ser>
           <c:idx val="1"/>
           <c:order val="1"/>
           <c:tx>
             <c:strRef>
-              <c:f>Sheet1!$C$1</c:f>
+              <c:f>Sheet1!$D$1</c:f>
               <c:strCache>
                 <c:ptCount val="1"/>
                 <c:pt idx="0">
-                  <c:v>Rossiya (tizimli ahamiyatli banklar)</c:v>
+                  <c:v>O‘zbekiston</c:v>
                 </c:pt>
               </c:strCache>
             </c:strRef>
           </c:tx>
           <c:spPr>
-            <a:solidFill>
-              <a:srgbClr val="EB6834"/>
-            </a:solidFill>
-            <a:ln w="6350">
+            <a:ln w="22225">
               <a:solidFill>
-                <a:srgbClr val="FFFFFF"/>
+                <a:srgbClr val="70AD47"/>
               </a:solidFill>
             </a:ln>
           </c:spPr>
-          <c:invertIfNegative val="0"/>
+          <c:marker>
+            <c:symbol val="triangle"/>
+            <c:size val="7"/>
+            <c:spPr>
+              <a:solidFill>
+                <a:srgbClr val="70AD47"/>
+              </a:solidFill>
+              <a:ln>
+                <a:noFill/>
+              </a:ln>
+            </c:spPr>
+          </c:marker>
           <c:dLbls>
-            <c:numFmt formatCode="0" sourceLinked="0"/>
+            <c:dLbl>
+              <c:idx val="0"/>
+              <c:delete val="1"/>
+            </c:dLbl>
+            <c:dLbl>
+              <c:idx val="4"/>
+              <c:delete val="1"/>
+            </c:dLbl>
+            <c:dLbl>
+              <c:idx val="5"/>
+              <c:delete val="1"/>
+            </c:dLbl>
+            <c:dLbl>
+              <c:idx val="6"/>
+              <c:delete val="1"/>
+            </c:dLbl>
+            <c:dLbl>
+              <c:idx val="7"/>
+              <c:delete val="1"/>
+            </c:dLbl>
+            <c:dLbl>
+              <c:idx val="8"/>
+              <c:delete val="1"/>
+            </c:dLbl>
+            <c:dLbl>
+              <c:idx val="9"/>
+              <c:delete val="1"/>
+            </c:dLbl>
+            <c:dLbl>
+              <c:idx val="10"/>
+              <c:delete val="1"/>
+            </c:dLbl>
+            <c:dLbl>
+              <c:idx val="11"/>
+              <c:delete val="1"/>
+            </c:dLbl>
             <c:spPr>
               <a:noFill/>
               <a:ln>
@@ -8877,9 +9602,9 @@
               <a:lstStyle/>
               <a:p>
                 <a:pPr>
-                  <a:defRPr sz="1050" b="1">
+                  <a:defRPr sz="1000" b="1">
                     <a:solidFill>
-                      <a:srgbClr val="000000"/>
+                      <a:srgbClr val="70AD47"/>
                     </a:solidFill>
                     <a:latin typeface="Times New Roman"/>
                     <a:cs typeface="Times New Roman"/>
@@ -8888,7 +9613,7 @@
                 <a:endParaRPr lang="uz-Latn-UZ"/>
               </a:p>
             </c:txPr>
-            <c:dLblPos val="outEnd"/>
+            <c:dLblPos val="t"/>
             <c:showLegendKey val="0"/>
             <c:showVal val="1"/>
             <c:showCatName val="0"/>
@@ -8896,11 +9621,12 @@
             <c:showPercent val="0"/>
             <c:showBubbleSize val="0"/>
           </c:dLbls>
-          <c:cat>
-            <c:strRef>
-              <c:f>Sheet1!$A$2:$A$6</c:f>
-              <c:strCache>
-                <c:ptCount val="5"/>
+          <c:xVal>
+            <c:numRef>
+              <c:f>Sheet1!$C$2:$C$13</c:f>
+              <c:numCache>
+                <c:formatCode>General</c:formatCode>
+                <c:ptCount val="12"/>
                 <c:pt idx="0">
                   <c:v>2015</c:v>
                 </c:pt>
@@ -8916,58 +9642,271 @@
                 <c:pt idx="4">
                   <c:v>2019</c:v>
                 </c:pt>
-              </c:strCache>
-            </c:strRef>
-          </c:cat>
-          <c:val>
+                <c:pt idx="5">
+                  <c:v>2020</c:v>
+                </c:pt>
+                <c:pt idx="6">
+                  <c:v>2021</c:v>
+                </c:pt>
+                <c:pt idx="7">
+                  <c:v>2022</c:v>
+                </c:pt>
+                <c:pt idx="8">
+                  <c:v>2023</c:v>
+                </c:pt>
+                <c:pt idx="9">
+                  <c:v>2024</c:v>
+                </c:pt>
+                <c:pt idx="10">
+                  <c:v>2025</c:v>
+                </c:pt>
+                <c:pt idx="11">
+                  <c:v>2026</c:v>
+                </c:pt>
+              </c:numCache>
+            </c:numRef>
+          </c:xVal>
+          <c:yVal>
             <c:numRef>
-              <c:f>Sheet1!$C$2:$C$6</c:f>
+              <c:f>Sheet1!$D$2:$D$13</c:f>
               <c:numCache>
                 <c:formatCode>General</c:formatCode>
-                <c:ptCount val="5"/>
+                <c:ptCount val="12"/>
                 <c:pt idx="1">
-                  <c:v>70</c:v>
+                  <c:v>80</c:v>
                 </c:pt>
                 <c:pt idx="2">
-                  <c:v>80</c:v>
+                  <c:v>90</c:v>
                 </c:pt>
                 <c:pt idx="3">
-                  <c:v>90</c:v>
+                  <c:v>100</c:v>
                 </c:pt>
                 <c:pt idx="4">
                   <c:v>100</c:v>
                 </c:pt>
+                <c:pt idx="5">
+                  <c:v>100</c:v>
+                </c:pt>
+                <c:pt idx="6">
+                  <c:v>100</c:v>
+                </c:pt>
+                <c:pt idx="7">
+                  <c:v>100</c:v>
+                </c:pt>
+                <c:pt idx="8">
+                  <c:v>100</c:v>
+                </c:pt>
+                <c:pt idx="9">
+                  <c:v>100</c:v>
+                </c:pt>
+                <c:pt idx="10">
+                  <c:v>100</c:v>
+                </c:pt>
+                <c:pt idx="11">
+                  <c:v>100</c:v>
+                </c:pt>
               </c:numCache>
             </c:numRef>
-          </c:val>
+          </c:yVal>
+          <c:smooth val="0"/>
         </c:ser>
         <c:ser>
           <c:idx val="2"/>
           <c:order val="2"/>
           <c:tx>
             <c:strRef>
-              <c:f>Sheet1!$D$1</c:f>
+              <c:f>Sheet1!$F$1</c:f>
               <c:strCache>
                 <c:ptCount val="1"/>
                 <c:pt idx="0">
-                  <c:v>O‘zbekiston</c:v>
+                  <c:v>Rossiya: rasmiy talab (2016–2019-yillarda Bazel jadvali bilan bir xil)</c:v>
                 </c:pt>
               </c:strCache>
             </c:strRef>
           </c:tx>
           <c:spPr>
-            <a:solidFill>
-              <a:srgbClr val="70AD47"/>
-            </a:solidFill>
-            <a:ln w="6350">
+            <a:ln w="25400">
               <a:solidFill>
-                <a:srgbClr val="FFFFFF"/>
+                <a:srgbClr val="EB6834"/>
               </a:solidFill>
+              <a:prstDash val="dash"/>
             </a:ln>
           </c:spPr>
-          <c:invertIfNegative val="0"/>
+          <c:marker>
+            <c:symbol val="square"/>
+            <c:size val="7"/>
+            <c:spPr>
+              <a:solidFill>
+                <a:srgbClr val="EB6834"/>
+              </a:solidFill>
+              <a:ln>
+                <a:noFill/>
+              </a:ln>
+            </c:spPr>
+          </c:marker>
+          <c:xVal>
+            <c:numRef>
+              <c:f>Sheet1!$E$2:$E$7</c:f>
+              <c:numCache>
+                <c:formatCode>General</c:formatCode>
+                <c:ptCount val="6"/>
+                <c:pt idx="0">
+                  <c:v>2016</c:v>
+                </c:pt>
+                <c:pt idx="1">
+                  <c:v>2017</c:v>
+                </c:pt>
+                <c:pt idx="2">
+                  <c:v>2018</c:v>
+                </c:pt>
+                <c:pt idx="3">
+                  <c:v>2019</c:v>
+                </c:pt>
+                <c:pt idx="4">
+                  <c:v>2020</c:v>
+                </c:pt>
+                <c:pt idx="5">
+                  <c:v>2021</c:v>
+                </c:pt>
+              </c:numCache>
+            </c:numRef>
+          </c:xVal>
+          <c:yVal>
+            <c:numRef>
+              <c:f>Sheet1!$F$2:$F$7</c:f>
+              <c:numCache>
+                <c:formatCode>General</c:formatCode>
+                <c:ptCount val="6"/>
+                <c:pt idx="0">
+                  <c:v>70</c:v>
+                </c:pt>
+                <c:pt idx="1">
+                  <c:v>80</c:v>
+                </c:pt>
+                <c:pt idx="2">
+                  <c:v>90</c:v>
+                </c:pt>
+                <c:pt idx="3">
+                  <c:v>100</c:v>
+                </c:pt>
+                <c:pt idx="4">
+                  <c:v>100</c:v>
+                </c:pt>
+                <c:pt idx="5">
+                  <c:v>100</c:v>
+                </c:pt>
+              </c:numCache>
+            </c:numRef>
+          </c:yVal>
+          <c:smooth val="0"/>
+        </c:ser>
+        <c:ser>
+          <c:idx val="3"/>
+          <c:order val="3"/>
+          <c:tx>
+            <c:strRef>
+              <c:f>Sheet1!$H$1</c:f>
+              <c:strCache>
+                <c:ptCount val="1"/>
+                <c:pt idx="0">
+                  <c:v>Rossiya 2</c:v>
+                </c:pt>
+              </c:strCache>
+            </c:strRef>
+          </c:tx>
+          <c:spPr>
+            <a:ln w="25400">
+              <a:solidFill>
+                <a:srgbClr val="EB6834"/>
+              </a:solidFill>
+              <a:prstDash val="dash"/>
+            </a:ln>
+          </c:spPr>
+          <c:marker>
+            <c:symbol val="square"/>
+            <c:size val="7"/>
+            <c:spPr>
+              <a:solidFill>
+                <a:srgbClr val="EB6834"/>
+              </a:solidFill>
+              <a:ln>
+                <a:noFill/>
+              </a:ln>
+            </c:spPr>
+          </c:marker>
+          <c:xVal>
+            <c:numRef>
+              <c:f>Sheet1!$G$2:$G$4</c:f>
+              <c:numCache>
+                <c:formatCode>General</c:formatCode>
+                <c:ptCount val="3"/>
+                <c:pt idx="0">
+                  <c:v>2024</c:v>
+                </c:pt>
+                <c:pt idx="1">
+                  <c:v>2025</c:v>
+                </c:pt>
+                <c:pt idx="2">
+                  <c:v>2026</c:v>
+                </c:pt>
+              </c:numCache>
+            </c:numRef>
+          </c:xVal>
+          <c:yVal>
+            <c:numRef>
+              <c:f>Sheet1!$H$2:$H$4</c:f>
+              <c:numCache>
+                <c:formatCode>General</c:formatCode>
+                <c:ptCount val="3"/>
+                <c:pt idx="0">
+                  <c:v>100</c:v>
+                </c:pt>
+                <c:pt idx="1">
+                  <c:v>100</c:v>
+                </c:pt>
+                <c:pt idx="2">
+                  <c:v>100</c:v>
+                </c:pt>
+              </c:numCache>
+            </c:numRef>
+          </c:yVal>
+          <c:smooth val="0"/>
+        </c:ser>
+        <c:ser>
+          <c:idx val="4"/>
+          <c:order val="4"/>
+          <c:tx>
+            <c:strRef>
+              <c:f>Sheet1!$J$1</c:f>
+              <c:strCache>
+                <c:ptCount val="1"/>
+                <c:pt idx="0">
+                  <c:v>Rossiya: o‘z mablag‘lari hisobidan (2022–2023-yillardagi yengillikdan keyin)</c:v>
+                </c:pt>
+              </c:strCache>
+            </c:strRef>
+          </c:tx>
+          <c:spPr>
+            <a:ln w="19050">
+              <a:solidFill>
+                <a:srgbClr val="C00000"/>
+              </a:solidFill>
+              <a:prstDash val="sysDot"/>
+            </a:ln>
+          </c:spPr>
+          <c:marker>
+            <c:symbol val="diamond"/>
+            <c:size val="7"/>
+            <c:spPr>
+              <a:solidFill>
+                <a:srgbClr val="C00000"/>
+              </a:solidFill>
+              <a:ln>
+                <a:noFill/>
+              </a:ln>
+            </c:spPr>
+          </c:marker>
           <c:dLbls>
-            <c:numFmt formatCode="0" sourceLinked="0"/>
             <c:spPr>
               <a:noFill/>
               <a:ln>
@@ -8979,9 +9918,9 @@
               <a:lstStyle/>
               <a:p>
                 <a:pPr>
-                  <a:defRPr sz="1050" b="1">
+                  <a:defRPr sz="1000" b="1">
                     <a:solidFill>
-                      <a:srgbClr val="000000"/>
+                      <a:srgbClr val="C00000"/>
                     </a:solidFill>
                     <a:latin typeface="Times New Roman"/>
                     <a:cs typeface="Times New Roman"/>
@@ -8990,7 +9929,7 @@
                 <a:endParaRPr lang="uz-Latn-UZ"/>
               </a:p>
             </c:txPr>
-            <c:dLblPos val="outEnd"/>
+            <c:dLblPos val="r"/>
             <c:showLegendKey val="0"/>
             <c:showVal val="1"/>
             <c:showCatName val="0"/>
@@ -8998,59 +9937,59 @@
             <c:showPercent val="0"/>
             <c:showBubbleSize val="0"/>
           </c:dLbls>
-          <c:cat>
-            <c:strRef>
-              <c:f>Sheet1!$A$2:$A$6</c:f>
-              <c:strCache>
-                <c:ptCount val="5"/>
-                <c:pt idx="0">
-                  <c:v>2015</c:v>
-                </c:pt>
-                <c:pt idx="1">
-                  <c:v>2016</c:v>
-                </c:pt>
-                <c:pt idx="2">
-                  <c:v>2017</c:v>
-                </c:pt>
-                <c:pt idx="3">
-                  <c:v>2018</c:v>
-                </c:pt>
-                <c:pt idx="4">
-                  <c:v>2019</c:v>
-                </c:pt>
-              </c:strCache>
-            </c:strRef>
-          </c:cat>
-          <c:val>
+          <c:xVal>
             <c:numRef>
-              <c:f>Sheet1!$D$2:$D$6</c:f>
+              <c:f>Sheet1!$I$2:$I$5</c:f>
               <c:numCache>
                 <c:formatCode>General</c:formatCode>
-                <c:ptCount val="5"/>
+                <c:ptCount val="4"/>
+                <c:pt idx="0">
+                  <c:v>2024.17</c:v>
+                </c:pt>
                 <c:pt idx="1">
-                  <c:v>80</c:v>
+                  <c:v>2024.5</c:v>
                 </c:pt>
                 <c:pt idx="2">
-                  <c:v>90</c:v>
+                  <c:v>2025.5</c:v>
                 </c:pt>
                 <c:pt idx="3">
-                  <c:v>100</c:v>
-                </c:pt>
-                <c:pt idx="4">
-                  <c:v>100</c:v>
+                  <c:v>2026</c:v>
                 </c:pt>
               </c:numCache>
             </c:numRef>
-          </c:val>
+          </c:xVal>
+          <c:yVal>
+            <c:numRef>
+              <c:f>Sheet1!$J$2:$J$5</c:f>
+              <c:numCache>
+                <c:formatCode>General</c:formatCode>
+                <c:ptCount val="4"/>
+                <c:pt idx="0">
+                  <c:v>40</c:v>
+                </c:pt>
+                <c:pt idx="1">
+                  <c:v>50</c:v>
+                </c:pt>
+                <c:pt idx="2">
+                  <c:v>60</c:v>
+                </c:pt>
+                <c:pt idx="3">
+                  <c:v>80</c:v>
+                </c:pt>
+              </c:numCache>
+            </c:numRef>
+          </c:yVal>
+          <c:smooth val="0"/>
         </c:ser>
-        <c:gapWidth val="60"/>
-        <c:axId val="111"/>
-        <c:axId val="222"/>
-      </c:barChart>
-      <c:catAx>
-        <c:axId val="111"/>
+        <c:axId val="333"/>
+        <c:axId val="444"/>
+      </c:scatterChart>
+      <c:valAx>
+        <c:axId val="333"/>
         <c:scaling>
           <c:orientation val="minMax"/>
+          <c:max val="2027"/>
+          <c:min val="2014"/>
         </c:scaling>
         <c:delete val="0"/>
         <c:axPos val="b"/>
@@ -9083,10 +10022,10 @@
           </c:tx>
           <c:overlay val="0"/>
         </c:title>
-        <c:numFmt formatCode="General" sourceLinked="0"/>
-        <c:majorTickMark val="none"/>
+        <c:numFmt formatCode="0" sourceLinked="0"/>
+        <c:majorTickMark val="out"/>
         <c:minorTickMark val="none"/>
-        <c:tickLblPos val="nextTo"/>
+        <c:tickLblPos val="low"/>
         <c:spPr>
           <a:ln w="9525">
             <a:solidFill>
@@ -9110,19 +10049,17 @@
             <a:endParaRPr lang="uz-Latn-UZ"/>
           </a:p>
         </c:txPr>
-        <c:crossAx val="222"/>
+        <c:crossAx val="444"/>
         <c:crosses val="autoZero"/>
-        <c:auto val="1"/>
-        <c:lblAlgn val="ctr"/>
-        <c:lblOffset val="100"/>
-        <c:noMultiLvlLbl val="0"/>
-      </c:catAx>
+        <c:crossBetween val="midCat"/>
+        <c:majorUnit val="1"/>
+      </c:valAx>
       <c:valAx>
-        <c:axId val="222"/>
+        <c:axId val="444"/>
         <c:scaling>
           <c:orientation val="minMax"/>
           <c:max val="110"/>
-          <c:min val="0"/>
+          <c:min val="30"/>
         </c:scaling>
         <c:delete val="0"/>
         <c:axPos val="l"/>
@@ -9191,10 +10128,10 @@
             <a:endParaRPr lang="uz-Latn-UZ"/>
           </a:p>
         </c:txPr>
-        <c:crossAx val="111"/>
+        <c:crossAx val="333"/>
         <c:crosses val="autoZero"/>
         <c:crossBetween val="midCat"/>
-        <c:majorUnit val="20"/>
+        <c:majorUnit val="10"/>
       </c:valAx>
       <c:spPr>
         <a:noFill/>
@@ -9205,6 +10142,10 @@
     </c:plotArea>
     <c:legend>
       <c:legendPos val="b"/>
+      <c:legendEntry>
+        <c:idx val="3"/>
+        <c:delete val="1"/>
+      </c:legendEntry>
       <c:overlay val="0"/>
       <c:txPr>
         <a:bodyPr/>

</xml_diff>